<commit_message>
Recover Night Monarch source and restore Crimson Elixir
</commit_message>
<xml_diff>
--- a/night-monarch/Night-Monarch-Revised-Master-Editable.docx
+++ b/night-monarch/Night-Monarch-Revised-Master-Editable.docx
@@ -17,7 +17,7 @@
     </w:p>
     <w:p>
       <w:r>
-        <w:t>Standalone class; complete source catalogue with author-approved revisions. Unfinished source mechanics are identified in the Design Notes.</w:t>
+        <w:t>Standalone class; revised-master rules with recovered source material. Unfinished donor interfaces are identified in the revision ledger.</w:t>
       </w:r>
     </w:p>
     <w:p>
@@ -2830,6 +2830,29 @@
         <w:pStyle w:val="Heading3"/>
       </w:pPr>
       <w:r>
+        <w:t>Crimson Elixir (Su)</w:t>
+      </w:r>
+    </w:p>
+    <w:p>
+      <w:r>
+        <w:t>The Night Monarch has a number of uses of Crimson Elixir per day equal to her Charisma modifier. Each use produces an elixir that, when consumed, heals the target as cure light wounds. Alternatively, the elixir grants the consuming creature the vampire template. Crimson Elixir has no blood-point cost.</w:t>
+      </w:r>
+    </w:p>
+    <w:p>
+      <w:r>
+        <w:t>Creation and handling: Creating an elixir is a standard action. The vial persists for 1 hour before losing potency. Drinking it is a standard action. These timings are preserved from the revised master; its former healing formula and blood-point cost are superseded by the author’s correction.</w:t>
+      </w:r>
+    </w:p>
+    <w:p>
+      <w:r>
+        <w:t>Unresolved details: The healing caster level and exact vampire-template source and eligibility still require definition. The older Fortitude-save, delayed-transformation, NPC-control and sickened clauses are not included in the newly confirmed alternative.</w:t>
+      </w:r>
+    </w:p>
+    <w:p>
+      <w:pPr>
+        <w:pStyle w:val="Heading3"/>
+      </w:pPr>
+      <w:r>
         <w:t>Soul Sight (Su)</w:t>
       </w:r>
     </w:p>
@@ -7460,12 +7483,12 @@
     </w:p>
     <w:p>
       <w:r>
-        <w:t>84. Light Halo (Su): As a standard action, fires a crescent blast in a 30-ft line dealing 1d6 radiant damage per two Hit Dice (max 10d6). At 10th level, fire two halos per action. At 15th level, halos explode on impact dealing half damage in a 10-ft radius.</w:t>
-      </w:r>
-    </w:p>
-    <w:p>
-      <w:r>
-        <w:t>85. Light Spear (Su): As a standard action, hurls a divine spear at a target within 60 feet dealing 1d8 radiant damage per two Hit Dice (max 10d8). Bypasses all DR except DR/-. At 12th level, summon two spears per action. At 18th level, spears explode on impact.</w:t>
+        <w:t>84. Light Halo (Su): As a standard action, fires a crescent blast in a 30-ft line dealing 1d6 radiant damage per two Hit Dice (max 10d6). At 10th level, fire two halos per action. At 15th level, halos explode on impact dealing half damage in a 10-ft radius. The beam extends +5 feet per level beyond the base range.</w:t>
+      </w:r>
+    </w:p>
+    <w:p>
+      <w:r>
+        <w:t>85. Light Spear (Su): As a standard action, hurls a divine spear at a target within 60 feet dealing 1d8 radiant damage per two Hit Dice (max 10d8). Bypasses all DR except DR/-. At 12th level, summon two spears per action. At 18th level, spears explode on impact, dealing half damage in a 10-foot radius.</w:t>
       </w:r>
     </w:p>
     <w:p>
@@ -7779,6 +7802,97 @@
         <w:pStyle w:val="Heading3"/>
       </w:pPr>
       <w:r>
+        <w:t>Recovered Jiangshi Catalogue Entries</w:t>
+      </w:r>
+    </w:p>
+    <w:p>
+      <w:r>
+        <w:t>These additional entries were recovered from the packet’s Jiangshi source. Entries that only summarize a shared feature still need its exact interface established; existing newer definitions are retained.</w:t>
+      </w:r>
+    </w:p>
+    <w:p>
+      <w:pPr>
+        <w:pStyle w:val="Heading3"/>
+      </w:pPr>
+      <w:r>
+        <w:t>Fast Magi-Change (Su)</w:t>
+      </w:r>
+    </w:p>
+    <w:p>
+      <w:r>
+        <w:t>Activate Magi-Change as a standard action.</w:t>
+      </w:r>
+    </w:p>
+    <w:p>
+      <w:pPr>
+        <w:pStyle w:val="Heading3"/>
+      </w:pPr>
+      <w:r>
+        <w:t>Lightning Magi-Change (Su)</w:t>
+      </w:r>
+    </w:p>
+    <w:p>
+      <w:r>
+        <w:t>Activate Magi-Change as a swift action.</w:t>
+      </w:r>
+    </w:p>
+    <w:p>
+      <w:pPr>
+        <w:pStyle w:val="Heading3"/>
+      </w:pPr>
+      <w:r>
+        <w:t>Sisterhood of the Master (Ex)</w:t>
+      </w:r>
+    </w:p>
+    <w:p>
+      <w:r>
+        <w:t>Morale bonus to saves and effective HD when near female companions.</w:t>
+      </w:r>
+    </w:p>
+    <w:p>
+      <w:pPr>
+        <w:pStyle w:val="Heading3"/>
+      </w:pPr>
+      <w:r>
+        <w:t>Companion of the Lonely (Ex)</w:t>
+      </w:r>
+    </w:p>
+    <w:p>
+      <w:r>
+        <w:t>+4 Diplomacy and swift messaging.</w:t>
+      </w:r>
+    </w:p>
+    <w:p>
+      <w:pPr>
+        <w:pStyle w:val="Heading3"/>
+      </w:pPr>
+      <w:r>
+        <w:t>Eyecandy (Ex)</w:t>
+      </w:r>
+    </w:p>
+    <w:p>
+      <w:r>
+        <w:t>+2 Charisma inherent bonus (+4 at 10th level).</w:t>
+      </w:r>
+    </w:p>
+    <w:p>
+      <w:pPr>
+        <w:pStyle w:val="Heading3"/>
+      </w:pPr>
+      <w:r>
+        <w:t>Initiate Magic (Sp)</w:t>
+      </w:r>
+    </w:p>
+    <w:p>
+      <w:r>
+        <w:t>Cast Charm Person, Cause Fear, and Vampiric Touch 3/day.</w:t>
+      </w:r>
+    </w:p>
+    <w:p>
+      <w:pPr>
+        <w:pStyle w:val="Heading3"/>
+      </w:pPr>
+      <w:r>
         <w:t>Kitsune</w:t>
       </w:r>
     </w:p>
@@ -9487,6 +9601,11 @@
     </w:p>
     <w:p>
       <w:r>
+        <w:t>Source classification conflict: The recovered page calls this a Normal Brand but supplies maneuver progression. The integrated revised master explicitly selects Martial Brand progression; that later decision governs this edition. Both source statements are recorded in the change ledger.</w:t>
+      </w:r>
+    </w:p>
+    <w:p>
+      <w:r>
         <w:t>Uses Martial Brand (Path of War) progression table. Theme: Illusory shapeshifting predator with tiger claws and infernal magic.</w:t>
       </w:r>
     </w:p>
@@ -10357,6 +10476,11 @@
       </w:r>
     </w:p>
     <w:p>
+      <w:r>
+        <w:t>Recovery comparison: The older Harlequin page uses Succubus donor names and leaves Death dealer, Magic deck, Throw anything and gambler unfinished. The revised master’s completed Death Dealer, Magic Deck and Throw Anything rules are retained. Gambler remains a reserve name; its former blood-point mechanic stays removed. Copied donor identities are not adopted as Harlequin’s identity.</w:t>
+      </w:r>
+    </w:p>
+    <w:p>
       <w:pPr>
         <w:pStyle w:val="Heading3"/>
       </w:pPr>
@@ -10419,17 +10543,2066 @@
     </w:p>
     <w:p>
       <w:r>
-        <w:t>Inspired by Magical Girl Lyrical Nanoha — intelligent magical device companion (Raising Heart, Reinforce, etc.). Uses its own unique progression table.</w:t>
-      </w:r>
-    </w:p>
-    <w:p>
-      <w:r>
-        <w:t>Full Unison Device rules, progression table, and all 28 Unison talents as written in original document. Key Features: Standby Mode (passive assistance), Unison Mode (merging for Str/Dex boost and barrier), Barrier System (temp HP = level x2 + Cha mod), Unison Bounty (access to all Unison talents while merged).</w:t>
-      </w:r>
-    </w:p>
-    <w:p>
-      <w:r>
-        <w:t>Notable Talents: Wolkenritter Covenant (four elite knight companions), Puppet Mode (device controls body if master incapacitated), Alternate Unison Target (merge with a Wolkenritter instead).</w:t>
+        <w:t>Reinforce, Eins, Zwei and Agito anchor one customizable Unison system. Raising Heart is not an anchor. This Brand does not grant a second unconditional level-1 companion.</w:t>
+      </w:r>
+    </w:p>
+    <w:p>
+      <w:r>
+        <w:t>Recovered owning source — adapter unfinished. The complete donor text follows, retaining “warlock” terminology and its original acquisition sentence as source evidence. That sentence does not grant a Night Monarch class feature. Night Monarch acquisition, host/statistic mappings and the unresolved interfaces below must be settled before this adapter is presented as finished.</w:t>
+      </w:r>
+    </w:p>
+    <w:p>
+      <w:pPr>
+        <w:pStyle w:val="Heading3"/>
+      </w:pPr>
+      <w:r>
+        <w:t>Unison Device — Recovered Donor Progression</w:t>
+      </w:r>
+    </w:p>
+    <w:tbl>
+      <w:tblPr>
+        <w:tblStyle w:val="LightShading-Accent1"/>
+        <w:tblW w:type="auto" w:w="0"/>
+        <w:tblLook w:firstColumn="1" w:firstRow="1" w:lastColumn="0" w:lastRow="0" w:noHBand="0" w:noVBand="1" w:val="04A0"/>
+      </w:tblPr>
+      <w:tblGrid>
+        <w:gridCol w:w="2045"/>
+        <w:gridCol w:w="2045"/>
+        <w:gridCol w:w="2045"/>
+        <w:gridCol w:w="2045"/>
+        <w:gridCol w:w="2045"/>
+      </w:tblGrid>
+      <w:tr>
+        <w:tc>
+          <w:tcPr>
+            <w:tcW w:type="dxa" w:w="2045"/>
+          </w:tcPr>
+          <w:p>
+            <w:r>
+              <w:t>level</w:t>
+            </w:r>
+          </w:p>
+        </w:tc>
+        <w:tc>
+          <w:tcPr>
+            <w:tcW w:type="dxa" w:w="2045"/>
+          </w:tcPr>
+          <w:p>
+            <w:r>
+              <w:t>Hit dice</w:t>
+            </w:r>
+          </w:p>
+        </w:tc>
+        <w:tc>
+          <w:tcPr>
+            <w:tcW w:type="dxa" w:w="2045"/>
+          </w:tcPr>
+          <w:p>
+            <w:r>
+              <w:t>special</w:t>
+            </w:r>
+          </w:p>
+        </w:tc>
+        <w:tc>
+          <w:tcPr>
+            <w:tcW w:type="dxa" w:w="2045"/>
+          </w:tcPr>
+          <w:p>
+            <w:r>
+              <w:t>Str/ dex boost</w:t>
+            </w:r>
+          </w:p>
+        </w:tc>
+        <w:tc>
+          <w:tcPr>
+            <w:tcW w:type="dxa" w:w="2045"/>
+          </w:tcPr>
+          <w:p>
+            <w:r>
+              <w:t>Talents</w:t>
+            </w:r>
+          </w:p>
+        </w:tc>
+      </w:tr>
+      <w:tr>
+        <w:tc>
+          <w:tcPr>
+            <w:tcW w:type="dxa" w:w="2045"/>
+          </w:tcPr>
+          <w:p>
+            <w:r>
+              <w:t>1</w:t>
+            </w:r>
+          </w:p>
+        </w:tc>
+        <w:tc>
+          <w:tcPr>
+            <w:tcW w:type="dxa" w:w="2045"/>
+          </w:tcPr>
+          <w:p>
+            <w:r>
+              <w:t>1</w:t>
+            </w:r>
+          </w:p>
+        </w:tc>
+        <w:tc>
+          <w:tcPr>
+            <w:tcW w:type="dxa" w:w="2045"/>
+          </w:tcPr>
+          <w:p>
+            <w:r>
+              <w:t>Unison boost, ether developmemt, alertness</w:t>
+            </w:r>
+          </w:p>
+        </w:tc>
+        <w:tc>
+          <w:tcPr>
+            <w:tcW w:type="dxa" w:w="2045"/>
+          </w:tcPr>
+          <w:p>
+            <w:r>
+              <w:t>—</w:t>
+            </w:r>
+          </w:p>
+        </w:tc>
+        <w:tc>
+          <w:tcPr>
+            <w:tcW w:type="dxa" w:w="2045"/>
+          </w:tcPr>
+          <w:p>
+            <w:r>
+              <w:t>2</w:t>
+            </w:r>
+          </w:p>
+        </w:tc>
+      </w:tr>
+      <w:tr>
+        <w:tc>
+          <w:tcPr>
+            <w:tcW w:type="dxa" w:w="2045"/>
+          </w:tcPr>
+          <w:p>
+            <w:r>
+              <w:t>2</w:t>
+            </w:r>
+          </w:p>
+        </w:tc>
+        <w:tc>
+          <w:tcPr>
+            <w:tcW w:type="dxa" w:w="2045"/>
+          </w:tcPr>
+          <w:p>
+            <w:r>
+              <w:t>1</w:t>
+            </w:r>
+          </w:p>
+        </w:tc>
+        <w:tc>
+          <w:tcPr>
+            <w:tcW w:type="dxa" w:w="2045"/>
+          </w:tcPr>
+          <w:p>
+            <w:r>
+              <w:t>Unison talent</w:t>
+            </w:r>
+          </w:p>
+        </w:tc>
+        <w:tc>
+          <w:tcPr>
+            <w:tcW w:type="dxa" w:w="2045"/>
+          </w:tcPr>
+          <w:p>
+            <w:r>
+              <w:t>—</w:t>
+            </w:r>
+          </w:p>
+        </w:tc>
+        <w:tc>
+          <w:tcPr>
+            <w:tcW w:type="dxa" w:w="2045"/>
+          </w:tcPr>
+          <w:p>
+            <w:r>
+              <w:t>3</w:t>
+            </w:r>
+          </w:p>
+        </w:tc>
+      </w:tr>
+      <w:tr>
+        <w:tc>
+          <w:tcPr>
+            <w:tcW w:type="dxa" w:w="2045"/>
+          </w:tcPr>
+          <w:p>
+            <w:r>
+              <w:t>3</w:t>
+            </w:r>
+          </w:p>
+        </w:tc>
+        <w:tc>
+          <w:tcPr>
+            <w:tcW w:type="dxa" w:w="2045"/>
+          </w:tcPr>
+          <w:p>
+            <w:r>
+              <w:t>2</w:t>
+            </w:r>
+          </w:p>
+        </w:tc>
+        <w:tc>
+          <w:tcPr>
+            <w:tcW w:type="dxa" w:w="2045"/>
+          </w:tcPr>
+          <w:p>
+            <w:r>
+              <w:t>armor</w:t>
+            </w:r>
+          </w:p>
+        </w:tc>
+        <w:tc>
+          <w:tcPr>
+            <w:tcW w:type="dxa" w:w="2045"/>
+          </w:tcPr>
+          <w:p>
+            <w:r>
+              <w:t>+0</w:t>
+            </w:r>
+          </w:p>
+        </w:tc>
+        <w:tc>
+          <w:tcPr>
+            <w:tcW w:type="dxa" w:w="2045"/>
+          </w:tcPr>
+          <w:p>
+            <w:r>
+              <w:t>3</w:t>
+            </w:r>
+          </w:p>
+        </w:tc>
+      </w:tr>
+      <w:tr>
+        <w:tc>
+          <w:tcPr>
+            <w:tcW w:type="dxa" w:w="2045"/>
+          </w:tcPr>
+          <w:p>
+            <w:r>
+              <w:t>4</w:t>
+            </w:r>
+          </w:p>
+        </w:tc>
+        <w:tc>
+          <w:tcPr>
+            <w:tcW w:type="dxa" w:w="2045"/>
+          </w:tcPr>
+          <w:p>
+            <w:r>
+              <w:t>3</w:t>
+            </w:r>
+          </w:p>
+        </w:tc>
+        <w:tc>
+          <w:tcPr>
+            <w:tcW w:type="dxa" w:w="2045"/>
+          </w:tcPr>
+          <w:p>
+            <w:r>
+              <w:t>Unison talent</w:t>
+            </w:r>
+          </w:p>
+        </w:tc>
+        <w:tc>
+          <w:tcPr>
+            <w:tcW w:type="dxa" w:w="2045"/>
+          </w:tcPr>
+          <w:p>
+            <w:r>
+              <w:t>+0</w:t>
+            </w:r>
+          </w:p>
+        </w:tc>
+        <w:tc>
+          <w:tcPr>
+            <w:tcW w:type="dxa" w:w="2045"/>
+          </w:tcPr>
+          <w:p>
+            <w:r>
+              <w:t>4</w:t>
+            </w:r>
+          </w:p>
+        </w:tc>
+      </w:tr>
+      <w:tr>
+        <w:tc>
+          <w:tcPr>
+            <w:tcW w:type="dxa" w:w="2045"/>
+          </w:tcPr>
+          <w:p>
+            <w:r>
+              <w:t>5</w:t>
+            </w:r>
+          </w:p>
+        </w:tc>
+        <w:tc>
+          <w:tcPr>
+            <w:tcW w:type="dxa" w:w="2045"/>
+          </w:tcPr>
+          <w:p>
+            <w:r>
+              <w:t>3</w:t>
+            </w:r>
+          </w:p>
+        </w:tc>
+        <w:tc>
+          <w:tcPr>
+            <w:tcW w:type="dxa" w:w="2045"/>
+          </w:tcPr>
+          <w:p>
+            <w:r>
+              <w:t>—</w:t>
+            </w:r>
+          </w:p>
+        </w:tc>
+        <w:tc>
+          <w:tcPr>
+            <w:tcW w:type="dxa" w:w="2045"/>
+          </w:tcPr>
+          <w:p>
+            <w:r>
+              <w:t>+2</w:t>
+            </w:r>
+          </w:p>
+        </w:tc>
+        <w:tc>
+          <w:tcPr>
+            <w:tcW w:type="dxa" w:w="2045"/>
+          </w:tcPr>
+          <w:p>
+            <w:r>
+              <w:t>4</w:t>
+            </w:r>
+          </w:p>
+        </w:tc>
+      </w:tr>
+      <w:tr>
+        <w:tc>
+          <w:tcPr>
+            <w:tcW w:type="dxa" w:w="2045"/>
+          </w:tcPr>
+          <w:p>
+            <w:r>
+              <w:t>6</w:t>
+            </w:r>
+          </w:p>
+        </w:tc>
+        <w:tc>
+          <w:tcPr>
+            <w:tcW w:type="dxa" w:w="2045"/>
+          </w:tcPr>
+          <w:p>
+            <w:r>
+              <w:t>4</w:t>
+            </w:r>
+          </w:p>
+        </w:tc>
+        <w:tc>
+          <w:tcPr>
+            <w:tcW w:type="dxa" w:w="2045"/>
+          </w:tcPr>
+          <w:p>
+            <w:r>
+              <w:t>Unison talent</w:t>
+            </w:r>
+          </w:p>
+        </w:tc>
+        <w:tc>
+          <w:tcPr>
+            <w:tcW w:type="dxa" w:w="2045"/>
+          </w:tcPr>
+          <w:p>
+            <w:r>
+              <w:t>+2</w:t>
+            </w:r>
+          </w:p>
+        </w:tc>
+        <w:tc>
+          <w:tcPr>
+            <w:tcW w:type="dxa" w:w="2045"/>
+          </w:tcPr>
+          <w:p>
+            <w:r>
+              <w:t>5</w:t>
+            </w:r>
+          </w:p>
+        </w:tc>
+      </w:tr>
+      <w:tr>
+        <w:tc>
+          <w:tcPr>
+            <w:tcW w:type="dxa" w:w="2045"/>
+          </w:tcPr>
+          <w:p>
+            <w:r>
+              <w:t>7</w:t>
+            </w:r>
+          </w:p>
+        </w:tc>
+        <w:tc>
+          <w:tcPr>
+            <w:tcW w:type="dxa" w:w="2045"/>
+          </w:tcPr>
+          <w:p>
+            <w:r>
+              <w:t>5</w:t>
+            </w:r>
+          </w:p>
+        </w:tc>
+        <w:tc>
+          <w:tcPr>
+            <w:tcW w:type="dxa" w:w="2045"/>
+          </w:tcPr>
+          <w:p>
+            <w:r>
+              <w:t>—</w:t>
+            </w:r>
+          </w:p>
+        </w:tc>
+        <w:tc>
+          <w:tcPr>
+            <w:tcW w:type="dxa" w:w="2045"/>
+          </w:tcPr>
+          <w:p>
+            <w:r>
+              <w:t>+2</w:t>
+            </w:r>
+          </w:p>
+        </w:tc>
+        <w:tc>
+          <w:tcPr>
+            <w:tcW w:type="dxa" w:w="2045"/>
+          </w:tcPr>
+          <w:p>
+            <w:r>
+              <w:t>5</w:t>
+            </w:r>
+          </w:p>
+        </w:tc>
+      </w:tr>
+      <w:tr>
+        <w:tc>
+          <w:tcPr>
+            <w:tcW w:type="dxa" w:w="2045"/>
+          </w:tcPr>
+          <w:p>
+            <w:r>
+              <w:t>8</w:t>
+            </w:r>
+          </w:p>
+        </w:tc>
+        <w:tc>
+          <w:tcPr>
+            <w:tcW w:type="dxa" w:w="2045"/>
+          </w:tcPr>
+          <w:p>
+            <w:r>
+              <w:t>6</w:t>
+            </w:r>
+          </w:p>
+        </w:tc>
+        <w:tc>
+          <w:tcPr>
+            <w:tcW w:type="dxa" w:w="2045"/>
+          </w:tcPr>
+          <w:p>
+            <w:r>
+              <w:t>Unison talent</w:t>
+            </w:r>
+          </w:p>
+        </w:tc>
+        <w:tc>
+          <w:tcPr>
+            <w:tcW w:type="dxa" w:w="2045"/>
+          </w:tcPr>
+          <w:p>
+            <w:r>
+              <w:t>+2</w:t>
+            </w:r>
+          </w:p>
+        </w:tc>
+        <w:tc>
+          <w:tcPr>
+            <w:tcW w:type="dxa" w:w="2045"/>
+          </w:tcPr>
+          <w:p>
+            <w:r>
+              <w:t>6</w:t>
+            </w:r>
+          </w:p>
+        </w:tc>
+      </w:tr>
+      <w:tr>
+        <w:tc>
+          <w:tcPr>
+            <w:tcW w:type="dxa" w:w="2045"/>
+          </w:tcPr>
+          <w:p>
+            <w:r>
+              <w:t>9</w:t>
+            </w:r>
+          </w:p>
+        </w:tc>
+        <w:tc>
+          <w:tcPr>
+            <w:tcW w:type="dxa" w:w="2045"/>
+          </w:tcPr>
+          <w:p>
+            <w:r>
+              <w:t>6</w:t>
+            </w:r>
+          </w:p>
+        </w:tc>
+        <w:tc>
+          <w:tcPr>
+            <w:tcW w:type="dxa" w:w="2045"/>
+          </w:tcPr>
+          <w:p>
+            <w:r>
+              <w:t>—</w:t>
+            </w:r>
+          </w:p>
+        </w:tc>
+        <w:tc>
+          <w:tcPr>
+            <w:tcW w:type="dxa" w:w="2045"/>
+          </w:tcPr>
+          <w:p>
+            <w:r>
+              <w:t>+4</w:t>
+            </w:r>
+          </w:p>
+        </w:tc>
+        <w:tc>
+          <w:tcPr>
+            <w:tcW w:type="dxa" w:w="2045"/>
+          </w:tcPr>
+          <w:p>
+            <w:r>
+              <w:t>6</w:t>
+            </w:r>
+          </w:p>
+        </w:tc>
+      </w:tr>
+      <w:tr>
+        <w:tc>
+          <w:tcPr>
+            <w:tcW w:type="dxa" w:w="2045"/>
+          </w:tcPr>
+          <w:p>
+            <w:r>
+              <w:t>10</w:t>
+            </w:r>
+          </w:p>
+        </w:tc>
+        <w:tc>
+          <w:tcPr>
+            <w:tcW w:type="dxa" w:w="2045"/>
+          </w:tcPr>
+          <w:p>
+            <w:r>
+              <w:t>7</w:t>
+            </w:r>
+          </w:p>
+        </w:tc>
+        <w:tc>
+          <w:tcPr>
+            <w:tcW w:type="dxa" w:w="2045"/>
+          </w:tcPr>
+          <w:p>
+            <w:r>
+              <w:t>Unison talent</w:t>
+            </w:r>
+          </w:p>
+        </w:tc>
+        <w:tc>
+          <w:tcPr>
+            <w:tcW w:type="dxa" w:w="2045"/>
+          </w:tcPr>
+          <w:p>
+            <w:r>
+              <w:t>+4</w:t>
+            </w:r>
+          </w:p>
+        </w:tc>
+        <w:tc>
+          <w:tcPr>
+            <w:tcW w:type="dxa" w:w="2045"/>
+          </w:tcPr>
+          <w:p>
+            <w:r>
+              <w:t>7</w:t>
+            </w:r>
+          </w:p>
+        </w:tc>
+      </w:tr>
+      <w:tr>
+        <w:tc>
+          <w:tcPr>
+            <w:tcW w:type="dxa" w:w="2045"/>
+          </w:tcPr>
+          <w:p>
+            <w:r>
+              <w:t>11</w:t>
+            </w:r>
+          </w:p>
+        </w:tc>
+        <w:tc>
+          <w:tcPr>
+            <w:tcW w:type="dxa" w:w="2045"/>
+          </w:tcPr>
+          <w:p>
+            <w:r>
+              <w:t>8</w:t>
+            </w:r>
+          </w:p>
+        </w:tc>
+        <w:tc>
+          <w:tcPr>
+            <w:tcW w:type="dxa" w:w="2045"/>
+          </w:tcPr>
+          <w:p>
+            <w:r>
+              <w:t>—</w:t>
+            </w:r>
+          </w:p>
+        </w:tc>
+        <w:tc>
+          <w:tcPr>
+            <w:tcW w:type="dxa" w:w="2045"/>
+          </w:tcPr>
+          <w:p>
+            <w:r>
+              <w:t>+4</w:t>
+            </w:r>
+          </w:p>
+        </w:tc>
+        <w:tc>
+          <w:tcPr>
+            <w:tcW w:type="dxa" w:w="2045"/>
+          </w:tcPr>
+          <w:p>
+            <w:r>
+              <w:t>7</w:t>
+            </w:r>
+          </w:p>
+        </w:tc>
+      </w:tr>
+      <w:tr>
+        <w:tc>
+          <w:tcPr>
+            <w:tcW w:type="dxa" w:w="2045"/>
+          </w:tcPr>
+          <w:p>
+            <w:r>
+              <w:t>12</w:t>
+            </w:r>
+          </w:p>
+        </w:tc>
+        <w:tc>
+          <w:tcPr>
+            <w:tcW w:type="dxa" w:w="2045"/>
+          </w:tcPr>
+          <w:p>
+            <w:r>
+              <w:t>9</w:t>
+            </w:r>
+          </w:p>
+        </w:tc>
+        <w:tc>
+          <w:tcPr>
+            <w:tcW w:type="dxa" w:w="2045"/>
+          </w:tcPr>
+          <w:p>
+            <w:r>
+              <w:t>Unison talent</w:t>
+            </w:r>
+          </w:p>
+        </w:tc>
+        <w:tc>
+          <w:tcPr>
+            <w:tcW w:type="dxa" w:w="2045"/>
+          </w:tcPr>
+          <w:p>
+            <w:r>
+              <w:t>+4</w:t>
+            </w:r>
+          </w:p>
+        </w:tc>
+        <w:tc>
+          <w:tcPr>
+            <w:tcW w:type="dxa" w:w="2045"/>
+          </w:tcPr>
+          <w:p>
+            <w:r>
+              <w:t>8</w:t>
+            </w:r>
+          </w:p>
+        </w:tc>
+      </w:tr>
+      <w:tr>
+        <w:tc>
+          <w:tcPr>
+            <w:tcW w:type="dxa" w:w="2045"/>
+          </w:tcPr>
+          <w:p>
+            <w:r>
+              <w:t>13</w:t>
+            </w:r>
+          </w:p>
+        </w:tc>
+        <w:tc>
+          <w:tcPr>
+            <w:tcW w:type="dxa" w:w="2045"/>
+          </w:tcPr>
+          <w:p>
+            <w:r>
+              <w:t>9</w:t>
+            </w:r>
+          </w:p>
+        </w:tc>
+        <w:tc>
+          <w:tcPr>
+            <w:tcW w:type="dxa" w:w="2045"/>
+          </w:tcPr>
+          <w:p>
+            <w:r>
+              <w:t>—</w:t>
+            </w:r>
+          </w:p>
+        </w:tc>
+        <w:tc>
+          <w:tcPr>
+            <w:tcW w:type="dxa" w:w="2045"/>
+          </w:tcPr>
+          <w:p>
+            <w:r>
+              <w:t>+6</w:t>
+            </w:r>
+          </w:p>
+        </w:tc>
+        <w:tc>
+          <w:tcPr>
+            <w:tcW w:type="dxa" w:w="2045"/>
+          </w:tcPr>
+          <w:p>
+            <w:r>
+              <w:t>8</w:t>
+            </w:r>
+          </w:p>
+        </w:tc>
+      </w:tr>
+      <w:tr>
+        <w:tc>
+          <w:tcPr>
+            <w:tcW w:type="dxa" w:w="2045"/>
+          </w:tcPr>
+          <w:p>
+            <w:r>
+              <w:t>14</w:t>
+            </w:r>
+          </w:p>
+        </w:tc>
+        <w:tc>
+          <w:tcPr>
+            <w:tcW w:type="dxa" w:w="2045"/>
+          </w:tcPr>
+          <w:p>
+            <w:r>
+              <w:t>10</w:t>
+            </w:r>
+          </w:p>
+        </w:tc>
+        <w:tc>
+          <w:tcPr>
+            <w:tcW w:type="dxa" w:w="2045"/>
+          </w:tcPr>
+          <w:p>
+            <w:r>
+              <w:t>Unison talent</w:t>
+            </w:r>
+          </w:p>
+        </w:tc>
+        <w:tc>
+          <w:tcPr>
+            <w:tcW w:type="dxa" w:w="2045"/>
+          </w:tcPr>
+          <w:p>
+            <w:r>
+              <w:t>+6</w:t>
+            </w:r>
+          </w:p>
+        </w:tc>
+        <w:tc>
+          <w:tcPr>
+            <w:tcW w:type="dxa" w:w="2045"/>
+          </w:tcPr>
+          <w:p>
+            <w:r>
+              <w:t>9</w:t>
+            </w:r>
+          </w:p>
+        </w:tc>
+      </w:tr>
+      <w:tr>
+        <w:tc>
+          <w:tcPr>
+            <w:tcW w:type="dxa" w:w="2045"/>
+          </w:tcPr>
+          <w:p>
+            <w:r>
+              <w:t>15</w:t>
+            </w:r>
+          </w:p>
+        </w:tc>
+        <w:tc>
+          <w:tcPr>
+            <w:tcW w:type="dxa" w:w="2045"/>
+          </w:tcPr>
+          <w:p>
+            <w:r>
+              <w:t>11</w:t>
+            </w:r>
+          </w:p>
+        </w:tc>
+        <w:tc>
+          <w:tcPr>
+            <w:tcW w:type="dxa" w:w="2045"/>
+          </w:tcPr>
+          <w:p>
+            <w:r>
+              <w:t>—</w:t>
+            </w:r>
+          </w:p>
+        </w:tc>
+        <w:tc>
+          <w:tcPr>
+            <w:tcW w:type="dxa" w:w="2045"/>
+          </w:tcPr>
+          <w:p>
+            <w:r>
+              <w:t>+6</w:t>
+            </w:r>
+          </w:p>
+        </w:tc>
+        <w:tc>
+          <w:tcPr>
+            <w:tcW w:type="dxa" w:w="2045"/>
+          </w:tcPr>
+          <w:p>
+            <w:r>
+              <w:t>9</w:t>
+            </w:r>
+          </w:p>
+        </w:tc>
+      </w:tr>
+      <w:tr>
+        <w:tc>
+          <w:tcPr>
+            <w:tcW w:type="dxa" w:w="2045"/>
+          </w:tcPr>
+          <w:p>
+            <w:r>
+              <w:t>16</w:t>
+            </w:r>
+          </w:p>
+        </w:tc>
+        <w:tc>
+          <w:tcPr>
+            <w:tcW w:type="dxa" w:w="2045"/>
+          </w:tcPr>
+          <w:p>
+            <w:r>
+              <w:t>12</w:t>
+            </w:r>
+          </w:p>
+        </w:tc>
+        <w:tc>
+          <w:tcPr>
+            <w:tcW w:type="dxa" w:w="2045"/>
+          </w:tcPr>
+          <w:p>
+            <w:r>
+              <w:t>Unison talent</w:t>
+            </w:r>
+          </w:p>
+        </w:tc>
+        <w:tc>
+          <w:tcPr>
+            <w:tcW w:type="dxa" w:w="2045"/>
+          </w:tcPr>
+          <w:p>
+            <w:r>
+              <w:t>+6</w:t>
+            </w:r>
+          </w:p>
+        </w:tc>
+        <w:tc>
+          <w:tcPr>
+            <w:tcW w:type="dxa" w:w="2045"/>
+          </w:tcPr>
+          <w:p>
+            <w:r>
+              <w:t>10</w:t>
+            </w:r>
+          </w:p>
+        </w:tc>
+      </w:tr>
+      <w:tr>
+        <w:tc>
+          <w:tcPr>
+            <w:tcW w:type="dxa" w:w="2045"/>
+          </w:tcPr>
+          <w:p>
+            <w:r>
+              <w:t>17</w:t>
+            </w:r>
+          </w:p>
+        </w:tc>
+        <w:tc>
+          <w:tcPr>
+            <w:tcW w:type="dxa" w:w="2045"/>
+          </w:tcPr>
+          <w:p>
+            <w:r>
+              <w:t>12</w:t>
+            </w:r>
+          </w:p>
+        </w:tc>
+        <w:tc>
+          <w:tcPr>
+            <w:tcW w:type="dxa" w:w="2045"/>
+          </w:tcPr>
+          <w:p>
+            <w:r>
+              <w:t>—</w:t>
+            </w:r>
+          </w:p>
+        </w:tc>
+        <w:tc>
+          <w:tcPr>
+            <w:tcW w:type="dxa" w:w="2045"/>
+          </w:tcPr>
+          <w:p>
+            <w:r>
+              <w:t>+8</w:t>
+            </w:r>
+          </w:p>
+        </w:tc>
+        <w:tc>
+          <w:tcPr>
+            <w:tcW w:type="dxa" w:w="2045"/>
+          </w:tcPr>
+          <w:p>
+            <w:r>
+              <w:t>10</w:t>
+            </w:r>
+          </w:p>
+        </w:tc>
+      </w:tr>
+      <w:tr>
+        <w:tc>
+          <w:tcPr>
+            <w:tcW w:type="dxa" w:w="2045"/>
+          </w:tcPr>
+          <w:p>
+            <w:r>
+              <w:t>18</w:t>
+            </w:r>
+          </w:p>
+        </w:tc>
+        <w:tc>
+          <w:tcPr>
+            <w:tcW w:type="dxa" w:w="2045"/>
+          </w:tcPr>
+          <w:p>
+            <w:r>
+              <w:t>13</w:t>
+            </w:r>
+          </w:p>
+        </w:tc>
+        <w:tc>
+          <w:tcPr>
+            <w:tcW w:type="dxa" w:w="2045"/>
+          </w:tcPr>
+          <w:p>
+            <w:r>
+              <w:t>Unison talent</w:t>
+            </w:r>
+          </w:p>
+        </w:tc>
+        <w:tc>
+          <w:tcPr>
+            <w:tcW w:type="dxa" w:w="2045"/>
+          </w:tcPr>
+          <w:p>
+            <w:r>
+              <w:t>+8</w:t>
+            </w:r>
+          </w:p>
+        </w:tc>
+        <w:tc>
+          <w:tcPr>
+            <w:tcW w:type="dxa" w:w="2045"/>
+          </w:tcPr>
+          <w:p>
+            <w:r>
+              <w:t>11</w:t>
+            </w:r>
+          </w:p>
+        </w:tc>
+      </w:tr>
+      <w:tr>
+        <w:tc>
+          <w:tcPr>
+            <w:tcW w:type="dxa" w:w="2045"/>
+          </w:tcPr>
+          <w:p>
+            <w:r>
+              <w:t>19</w:t>
+            </w:r>
+          </w:p>
+        </w:tc>
+        <w:tc>
+          <w:tcPr>
+            <w:tcW w:type="dxa" w:w="2045"/>
+          </w:tcPr>
+          <w:p>
+            <w:r>
+              <w:t>14</w:t>
+            </w:r>
+          </w:p>
+        </w:tc>
+        <w:tc>
+          <w:tcPr>
+            <w:tcW w:type="dxa" w:w="2045"/>
+          </w:tcPr>
+          <w:p>
+            <w:r>
+              <w:t>—</w:t>
+            </w:r>
+          </w:p>
+        </w:tc>
+        <w:tc>
+          <w:tcPr>
+            <w:tcW w:type="dxa" w:w="2045"/>
+          </w:tcPr>
+          <w:p>
+            <w:r>
+              <w:t>+8</w:t>
+            </w:r>
+          </w:p>
+        </w:tc>
+        <w:tc>
+          <w:tcPr>
+            <w:tcW w:type="dxa" w:w="2045"/>
+          </w:tcPr>
+          <w:p>
+            <w:r>
+              <w:t>11</w:t>
+            </w:r>
+          </w:p>
+        </w:tc>
+      </w:tr>
+      <w:tr>
+        <w:tc>
+          <w:tcPr>
+            <w:tcW w:type="dxa" w:w="2045"/>
+          </w:tcPr>
+          <w:p>
+            <w:r>
+              <w:t>20</w:t>
+            </w:r>
+          </w:p>
+        </w:tc>
+        <w:tc>
+          <w:tcPr>
+            <w:tcW w:type="dxa" w:w="2045"/>
+          </w:tcPr>
+          <w:p>
+            <w:r>
+              <w:t>15</w:t>
+            </w:r>
+          </w:p>
+        </w:tc>
+        <w:tc>
+          <w:tcPr>
+            <w:tcW w:type="dxa" w:w="2045"/>
+          </w:tcPr>
+          <w:p>
+            <w:r>
+              <w:t>—</w:t>
+            </w:r>
+          </w:p>
+        </w:tc>
+        <w:tc>
+          <w:tcPr>
+            <w:tcW w:type="dxa" w:w="2045"/>
+          </w:tcPr>
+          <w:p>
+            <w:r>
+              <w:t>+8</w:t>
+            </w:r>
+          </w:p>
+        </w:tc>
+        <w:tc>
+          <w:tcPr>
+            <w:tcW w:type="dxa" w:w="2045"/>
+          </w:tcPr>
+          <w:p>
+            <w:r>
+              <w:t>12</w:t>
+            </w:r>
+          </w:p>
+        </w:tc>
+      </w:tr>
+    </w:tbl>
+    <w:p>
+      <w:pPr>
+        <w:pStyle w:val="Heading3"/>
+      </w:pPr>
+      <w:r>
+        <w:t>Unison Device (Su)</w:t>
+      </w:r>
+    </w:p>
+    <w:p>
+      <w:r>
+        <w:t>At 1st level the warlock is partnered with a Unison Device, a tiny intelligent magical construct or spirit that acts as both assistant and amplifier of the warlock’s power.</w:t>
+      </w:r>
+    </w:p>
+    <w:p>
+      <w:r>
+        <w:t>The device typically appears as a pixie-sized entity, floating object, or small spirit avatar. It possesses its own personality and may communicate verbally or telepathically with its master.</w:t>
+      </w:r>
+    </w:p>
+    <w:p>
+      <w:r>
+        <w:t>The Unison Device functions as a companion using the progression shown on the Unison Device table.</w:t>
+      </w:r>
+    </w:p>
+    <w:p>
+      <w:r>
+        <w:t>The device has the following base traits:</w:t>
+      </w:r>
+    </w:p>
+    <w:p>
+      <w:r>
+        <w:t>• Size: Tiny</w:t>
+      </w:r>
+    </w:p>
+    <w:p>
+      <w:r>
+        <w:t>• Type: Construct or Outsider (spirit)</w:t>
+      </w:r>
+    </w:p>
+    <w:p>
+      <w:r>
+        <w:t>• Intelligence: 10</w:t>
+      </w:r>
+    </w:p>
+    <w:p>
+      <w:r>
+        <w:t>• Languages: understands its master</w:t>
+      </w:r>
+    </w:p>
+    <w:p>
+      <w:r>
+        <w:t>• Speed: fly 30 ft (perfect)</w:t>
+      </w:r>
+    </w:p>
+    <w:p>
+      <w:r>
+        <w:t>The device normally exists in Standby Mode, but may merge with its master using Unison Mode.</w:t>
+      </w:r>
+    </w:p>
+    <w:p>
+      <w:pPr>
+        <w:pStyle w:val="Heading3"/>
+      </w:pPr>
+      <w:r>
+        <w:t>Standby Mode</w:t>
+      </w:r>
+    </w:p>
+    <w:p>
+      <w:r>
+        <w:t>While in standby, the Unison Device acts independently and occupies its own space.</w:t>
+      </w:r>
+    </w:p>
+    <w:p>
+      <w:r>
+        <w:t>In this state it provides passive assistance to the warlock and grants the following benefits:</w:t>
+      </w:r>
+    </w:p>
+    <w:p>
+      <w:r>
+        <w:t>• Alertness feat while within 30 ft</w:t>
+      </w:r>
+    </w:p>
+    <w:p>
+      <w:r>
+        <w:t>• may communicate with the warlock at any distance on the same plane</w:t>
+      </w:r>
+    </w:p>
+    <w:p>
+      <w:r>
+        <w:t>• may deliver touch spells for the warlock</w:t>
+      </w:r>
+    </w:p>
+    <w:p>
+      <w:r>
+        <w:t>The device is not primarily a combatant and rarely makes attacks.</w:t>
+      </w:r>
+    </w:p>
+    <w:p>
+      <w:pPr>
+        <w:pStyle w:val="Heading3"/>
+      </w:pPr>
+      <w:r>
+        <w:t>Unison Mode</w:t>
+      </w:r>
+    </w:p>
+    <w:p>
+      <w:r>
+        <w:t>As a standard action the warlock may merge with their Unison Device, entering Unison Mode.</w:t>
+      </w:r>
+    </w:p>
+    <w:p>
+      <w:r>
+        <w:t>While merged:</w:t>
+      </w:r>
+    </w:p>
+    <w:p>
+      <w:r>
+        <w:t>• the device occupies the warlock’s space</w:t>
+      </w:r>
+    </w:p>
+    <w:p>
+      <w:r>
+        <w:t>• the warlock gains the Strength/Dexterity bonus listed on the table</w:t>
+      </w:r>
+    </w:p>
+    <w:p>
+      <w:r>
+        <w:t>• the warlock gains access to Unison talents that function only during Unison Mode</w:t>
+      </w:r>
+    </w:p>
+    <w:p>
+      <w:r>
+        <w:t>Unison Mode lasts a number of rounds equal to the warlock’s caster level.</w:t>
+      </w:r>
+    </w:p>
+    <w:p>
+      <w:r>
+        <w:t>Ending Unison Mode is a free action.</w:t>
+      </w:r>
+    </w:p>
+    <w:p>
+      <w:r>
+        <w:t>If the warlock becomes unconscious the Unison immediately ends.</w:t>
+      </w:r>
+    </w:p>
+    <w:p>
+      <w:pPr>
+        <w:pStyle w:val="Heading3"/>
+      </w:pPr>
+      <w:r>
+        <w:t>Barrier System</w:t>
+      </w:r>
+    </w:p>
+    <w:p>
+      <w:r>
+        <w:t>When entering Unison Mode the device generates a magical barrier protecting the warlock.</w:t>
+      </w:r>
+    </w:p>
+    <w:p>
+      <w:pPr>
+        <w:pStyle w:val="Heading3"/>
+      </w:pPr>
+      <w:r>
+        <w:t>Barrier Strength =</w:t>
+      </w:r>
+    </w:p>
+    <w:p>
+      <w:pPr>
+        <w:pStyle w:val="Heading3"/>
+      </w:pPr>
+      <w:r>
+        <w:t>warlock level × 2 + Charisma modifier</w:t>
+      </w:r>
+    </w:p>
+    <w:p>
+      <w:r>
+        <w:t>Barrier strength functions as temporary hit points.</w:t>
+      </w:r>
+    </w:p>
+    <w:p>
+      <w:r>
+        <w:t>Damage is deducted from the barrier before affecting the warlock.</w:t>
+      </w:r>
+    </w:p>
+    <w:p>
+      <w:r>
+        <w:t>When the barrier reaches 0 it collapses.</w:t>
+      </w:r>
+    </w:p>
+    <w:p>
+      <w:r>
+        <w:t>Barrier strength is restored when Unison Mode ends.</w:t>
+      </w:r>
+    </w:p>
+    <w:p>
+      <w:pPr>
+        <w:pStyle w:val="Heading3"/>
+      </w:pPr>
+      <w:r>
+        <w:t>Unison Bounty (Su)</w:t>
+      </w:r>
+    </w:p>
+    <w:p>
+      <w:r>
+        <w:t>While in Unison Mode, the warlock gains the benefits of all Unison talents possessed by the Unison Device. If a talent would normally require an action from the device, the warlock may instead perform that action.</w:t>
+      </w:r>
+    </w:p>
+    <w:p>
+      <w:r>
+        <w:t>Talents that modify the barrier, synchronization, or spellcasting apply directly to the warlock while merged.</w:t>
+      </w:r>
+    </w:p>
+    <w:p>
+      <w:r>
+        <w:t>Once Unison Mode ends, the device regains control of its talents.</w:t>
+      </w:r>
+    </w:p>
+    <w:p>
+      <w:pPr>
+        <w:pStyle w:val="Heading3"/>
+      </w:pPr>
+      <w:r>
+        <w:t>Unison talents 17 done 11 to go</w:t>
+      </w:r>
+    </w:p>
+    <w:p>
+      <w:pPr>
+        <w:pStyle w:val="Heading3"/>
+      </w:pPr>
+      <w:r>
+        <w:t>Lightning Unison</w:t>
+      </w:r>
+    </w:p>
+    <w:p>
+      <w:r>
+        <w:t>"Synchronization becomes instantaneous, body and spirit moving as one."</w:t>
+      </w:r>
+    </w:p>
+    <w:p>
+      <w:r>
+        <w:t>If the warlock possesses Fast Unison, activating Unison Mode becomes a free action instead of a swift action.</w:t>
+      </w:r>
+    </w:p>
+    <w:p>
+      <w:r>
+        <w:t>This ability may only be used once per round.</w:t>
+      </w:r>
+    </w:p>
+    <w:p>
+      <w:pPr>
+        <w:pStyle w:val="Heading3"/>
+      </w:pPr>
+      <w:r>
+        <w:t>Combat Assist</w:t>
+      </w:r>
+    </w:p>
+    <w:p>
+      <w:r>
+        <w:t>"The device predicts movement and corrects its partner’s aim."</w:t>
+      </w:r>
+    </w:p>
+    <w:p>
+      <w:r>
+        <w:t>While within 30 ft of the warlock, the device may Aid Another as a swift action.</w:t>
+      </w:r>
+    </w:p>
+    <w:p>
+      <w:r>
+        <w:t>When used during Unison Mode, the warlock gains a +2 competence bonus on attack rolls and combat maneuver checks for 1 round.</w:t>
+      </w:r>
+    </w:p>
+    <w:p>
+      <w:pPr>
+        <w:pStyle w:val="Heading3"/>
+      </w:pPr>
+      <w:r>
+        <w:t>Config Expertise</w:t>
+      </w:r>
+    </w:p>
+    <w:p>
+      <w:r>
+        <w:t>"The device constantly recalibrates magical and tactical parameters."</w:t>
+      </w:r>
+    </w:p>
+    <w:p>
+      <w:r>
+        <w:t>The warlock gains a +2 competence bonus on initiative and concentration checks.</w:t>
+      </w:r>
+    </w:p>
+    <w:p>
+      <w:r>
+        <w:t>While in Unison Mode, this bonus increases to +4.</w:t>
+      </w:r>
+    </w:p>
+    <w:p>
+      <w:pPr>
+        <w:pStyle w:val="Heading3"/>
+      </w:pPr>
+      <w:r>
+        <w:t>Greater Barrier</w:t>
+      </w:r>
+    </w:p>
+    <w:p>
+      <w:r>
+        <w:t>"The defensive field strengthens into layered protection."</w:t>
+      </w:r>
+    </w:p>
+    <w:p>
+      <w:r>
+        <w:t>The maximum strength of the Unison Barrier increases by an amount equal to the warlock’s Charisma modifier + device level.</w:t>
+      </w:r>
+    </w:p>
+    <w:p>
+      <w:pPr>
+        <w:pStyle w:val="Heading3"/>
+      </w:pPr>
+      <w:r>
+        <w:t>Lingering Barrier</w:t>
+      </w:r>
+    </w:p>
+    <w:p>
+      <w:r>
+        <w:t>"The barrier remains active even as its energy fluctuates."</w:t>
+      </w:r>
+    </w:p>
+    <w:p>
+      <w:r>
+        <w:t>When the Unison Barrier is reduced to 0 hit points, it does not immediately collapse.</w:t>
+      </w:r>
+    </w:p>
+    <w:p>
+      <w:r>
+        <w:t>Instead, it remains active until the end of the current round.</w:t>
+      </w:r>
+    </w:p>
+    <w:p>
+      <w:pPr>
+        <w:pStyle w:val="Heading3"/>
+      </w:pPr>
+      <w:r>
+        <w:t>Reinforce Barrier</w:t>
+      </w:r>
+    </w:p>
+    <w:p>
+      <w:r>
+        <w:t>"The device channels additional energy to repair the defensive field."</w:t>
+      </w:r>
+    </w:p>
+    <w:p>
+      <w:r>
+        <w:t>While in Unison Mode, the warlock may spend 1 spell point as a swift action to restore barrier strength equal to 1d6 per two caster levels (maximum 10d6).</w:t>
+      </w:r>
+    </w:p>
+    <w:p>
+      <w:r>
+        <w:t>Barrier strength cannot exceed its normal maximum.</w:t>
+      </w:r>
+    </w:p>
+    <w:p>
+      <w:pPr>
+        <w:pStyle w:val="Heading3"/>
+      </w:pPr>
+      <w:r>
+        <w:t>Unison Barrier</w:t>
+      </w:r>
+    </w:p>
+    <w:p>
+      <w:r>
+        <w:t>"Synchronization manifests as a protective field of magical force."</w:t>
+      </w:r>
+    </w:p>
+    <w:p>
+      <w:r>
+        <w:t>When Unison Mode begins, the warlock gains temporary hit points equal to twice the warlock’s level + Charisma modifier.</w:t>
+      </w:r>
+    </w:p>
+    <w:p>
+      <w:r>
+        <w:t>These temporary hit points function as the Unison Barrier.</w:t>
+      </w:r>
+    </w:p>
+    <w:p>
+      <w:pPr>
+        <w:pStyle w:val="Heading3"/>
+      </w:pPr>
+      <w:r>
+        <w:t>Master’s Spells</w:t>
+      </w:r>
+    </w:p>
+    <w:p>
+      <w:r>
+        <w:t>"The device records and preserves magical formulas for its partner."</w:t>
+      </w:r>
+    </w:p>
+    <w:p>
+      <w:r>
+        <w:t>The Unison Device may store a number of spells equal to the warlock’s Charisma modifier.</w:t>
+      </w:r>
+    </w:p>
+    <w:p>
+      <w:r>
+        <w:t>The warlock may cast these stored spells without preparing them, though they still expend normal spell slots or spell points.</w:t>
+      </w:r>
+    </w:p>
+    <w:p>
+      <w:pPr>
+        <w:pStyle w:val="Heading3"/>
+      </w:pPr>
+      <w:r>
+        <w:t>Crest of Ars Magus</w:t>
+      </w:r>
+    </w:p>
+    <w:p>
+      <w:r>
+        <w:t>"The device channels spellcasting power independently."</w:t>
+      </w:r>
+    </w:p>
+    <w:p>
+      <w:r>
+        <w:t>While in Standby Mode, the Unison Device may cast one stored spell per round as a standard action, using the warlock’s caster level and spellcasting ability.</w:t>
+      </w:r>
+    </w:p>
+    <w:p>
+      <w:pPr>
+        <w:pStyle w:val="Heading3"/>
+      </w:pPr>
+      <w:r>
+        <w:t>Steal Linker Core</w:t>
+      </w:r>
+    </w:p>
+    <w:p>
+      <w:r>
+        <w:t>"The device siphons magical power from defeated foes."</w:t>
+      </w:r>
+    </w:p>
+    <w:p>
+      <w:r>
+        <w:t>When a creature within 30 ft is reduced to 0 hit points, the warlock may gain 1 temporary spell point.</w:t>
+      </w:r>
+    </w:p>
+    <w:p>
+      <w:r>
+        <w:t>Temporary spell points gained this way last 1 minute.</w:t>
+      </w:r>
+    </w:p>
+    <w:p>
+      <w:pPr>
+        <w:pStyle w:val="Heading3"/>
+      </w:pPr>
+      <w:r>
+        <w:t>Linker Core Storage</w:t>
+      </w:r>
+    </w:p>
+    <w:p>
+      <w:r>
+        <w:t>"The device stabilizes and preserves magical energy."</w:t>
+      </w:r>
+    </w:p>
+    <w:p>
+      <w:r>
+        <w:t>Temporary spell points gained from Steal Linker Core last 10 minutes instead of 1 minute.</w:t>
+      </w:r>
+    </w:p>
+    <w:p>
+      <w:r>
+        <w:t>The warlock may store a number of temporary spell points equal to the device’s level.</w:t>
+      </w:r>
+    </w:p>
+    <w:p>
+      <w:pPr>
+        <w:pStyle w:val="Heading3"/>
+      </w:pPr>
+      <w:r>
+        <w:t>Translator</w:t>
+      </w:r>
+    </w:p>
+    <w:p>
+      <w:r>
+        <w:t>"The device interprets languages and magical communication."</w:t>
+      </w:r>
+    </w:p>
+    <w:p>
+      <w:r>
+        <w:t>The warlock gains the effects of tongues while the Unison Device is within 30 ft.</w:t>
+      </w:r>
+    </w:p>
+    <w:p>
+      <w:pPr>
+        <w:pStyle w:val="Heading3"/>
+      </w:pPr>
+      <w:r>
+        <w:t>Companion for the Lonely</w:t>
+      </w:r>
+    </w:p>
+    <w:p>
+      <w:r>
+        <w:t>"The bond between master and device grows into true companionship."</w:t>
+      </w:r>
+    </w:p>
+    <w:p>
+      <w:r>
+        <w:t>The Unison Device gains a +2 bonus on Will saves and immunity to fear effects.</w:t>
+      </w:r>
+    </w:p>
+    <w:p>
+      <w:r>
+        <w:t>While in Unison Mode, the warlock gains the same benefits.</w:t>
+      </w:r>
+    </w:p>
+    <w:p>
+      <w:pPr>
+        <w:pStyle w:val="Heading3"/>
+      </w:pPr>
+      <w:r>
+        <w:t>Puppet Mode</w:t>
+      </w:r>
+    </w:p>
+    <w:p>
+      <w:pPr>
+        <w:pStyle w:val="Heading3"/>
+      </w:pPr>
+      <w:r>
+        <w:t>Unison Talent</w:t>
+      </w:r>
+    </w:p>
+    <w:p>
+      <w:r>
+        <w:t>If the warlock becomes unconscious, stunned, or otherwise unable to act while the Unison Device is present, the device may immediately assume control of the warlock’s body as an immediate action.</w:t>
+      </w:r>
+    </w:p>
+    <w:p>
+      <w:r>
+        <w:t>While Puppet Mode is active:</w:t>
+      </w:r>
+    </w:p>
+    <w:p>
+      <w:r>
+        <w:t>• the warlock is treated as conscious but under the device’s control</w:t>
+      </w:r>
+    </w:p>
+    <w:p>
+      <w:r>
+        <w:t>• the device uses its own Intelligence, Wisdom, and Charisma</w:t>
+      </w:r>
+    </w:p>
+    <w:p>
+      <w:r>
+        <w:t>• the warlock’s physical ability scores remain unchanged</w:t>
+      </w:r>
+    </w:p>
+    <w:p>
+      <w:r>
+        <w:t>• the device may move the body and perform actions normally available to the warlock</w:t>
+      </w:r>
+    </w:p>
+    <w:p>
+      <w:r>
+        <w:t>Puppet Mode lasts for a number of rounds equal to the device’s level or until the warlock regains consciousness.</w:t>
+      </w:r>
+    </w:p>
+    <w:p>
+      <w:r>
+        <w:t>When Puppet Mode ends, the warlock becomes unconscious again if they have not recovered.</w:t>
+      </w:r>
+    </w:p>
+    <w:p>
+      <w:pPr>
+        <w:pStyle w:val="Heading3"/>
+      </w:pPr>
+      <w:r>
+        <w:t>Special:</w:t>
+      </w:r>
+    </w:p>
+    <w:p>
+      <w:r>
+        <w:t>If Unison Mode is active when the warlock is incapacitated, Puppet Mode automatically activates without consuming an action.</w:t>
+      </w:r>
+    </w:p>
+    <w:p>
+      <w:pPr>
+        <w:pStyle w:val="Heading3"/>
+      </w:pPr>
+      <w:r>
+        <w:t>Wolkenritter Covenant</w:t>
+      </w:r>
+    </w:p>
+    <w:p>
+      <w:r>
+        <w:t>"The device awakens the ancient knight spirits bound within its core."</w:t>
+      </w:r>
+    </w:p>
+    <w:p>
+      <w:r>
+        <w:t>The Unison Device gains the Leadership feat, using the device’s level as its character level and the warlock’s Charisma modifier when determining its Leadership score.</w:t>
+      </w:r>
+    </w:p>
+    <w:p>
+      <w:r>
+        <w:t>Instead of normal followers, this ability grants four elite knight companions known as the Wolkenritter. These knights are loyal retainers permanently bound to the device.</w:t>
+      </w:r>
+    </w:p>
+    <w:p>
+      <w:r>
+        <w:t>The Wolkenritter function as cohort-level companions and are always considered devoted allies of both the warlock and the Unison Device.</w:t>
+      </w:r>
+    </w:p>
+    <w:p>
+      <w:r>
+        <w:t>The exact form and abilities of each knight are determined by the GM, though they typically represent different combat roles such as:</w:t>
+      </w:r>
+    </w:p>
+    <w:p>
+      <w:r>
+        <w:t>• armored vanguard</w:t>
+      </w:r>
+    </w:p>
+    <w:p>
+      <w:r>
+        <w:t>• weapon master</w:t>
+      </w:r>
+    </w:p>
+    <w:p>
+      <w:r>
+        <w:t>• guardian beast</w:t>
+      </w:r>
+    </w:p>
+    <w:p>
+      <w:r>
+        <w:t>• support mage</w:t>
+      </w:r>
+    </w:p>
+    <w:p>
+      <w:r>
+        <w:t>While the warlock is in Unison Mode, the Wolkenritter gain a +2 morale bonus on attack rolls, saving throws, and skill checks while within 30 ft of the warlock.</w:t>
+      </w:r>
+    </w:p>
+    <w:p>
+      <w:r>
+        <w:t>If a Wolkenritter is slain, a replacement cannot be gained for one month.</w:t>
+      </w:r>
+    </w:p>
+    <w:p>
+      <w:pPr>
+        <w:pStyle w:val="Heading3"/>
+      </w:pPr>
+      <w:r>
+        <w:t>Alternate Unison Target</w:t>
+      </w:r>
+    </w:p>
+    <w:p>
+      <w:r>
+        <w:t>The Unison Device normally merges with its master when activating Unison Mode.</w:t>
+      </w:r>
+    </w:p>
+    <w:p>
+      <w:r>
+        <w:t>If the device possesses the Wolkenritter Covenant talent, it may instead merge with one of the Wolkenritter within 30 ft.</w:t>
+      </w:r>
+    </w:p>
+    <w:p>
+      <w:r>
+        <w:t>When merging with a Wolkenritter:</w:t>
+      </w:r>
+    </w:p>
+    <w:p>
+      <w:r>
+        <w:t>• that knight gains the benefits of Unison Bounty</w:t>
+      </w:r>
+    </w:p>
+    <w:p>
+      <w:r>
+        <w:t>• the warlock does not gain Unison benefits while the device is merged with a knight</w:t>
+      </w:r>
+    </w:p>
+    <w:p>
+      <w:r>
+        <w:t>• the device occupies the knight’s space and cannot be targeted separately</w:t>
+      </w:r>
+    </w:p>
+    <w:p>
+      <w:r>
+        <w:t>Ending the Unison is a free action, after which the device reappears adjacent to its host.</w:t>
+      </w:r>
+    </w:p>
+    <w:p>
+      <w:pPr>
+        <w:pStyle w:val="Heading3"/>
+      </w:pPr>
+      <w:r>
+        <w:t>Tactical Scanner</w:t>
+      </w:r>
+    </w:p>
+    <w:p>
+      <w:r>
+        <w:t>"The device constantly analyzes the battlefield."</w:t>
+      </w:r>
+    </w:p>
+    <w:p>
+      <w:r>
+        <w:t>The warlock gains a +2 bonus on Perception and Sense Motive checks.</w:t>
+      </w:r>
+    </w:p>
+    <w:p>
+      <w:r>
+        <w:t>While in Unison Mode, the warlock also gains +2 to initiative.</w:t>
+      </w:r>
+    </w:p>
+    <w:p>
+      <w:pPr>
+        <w:pStyle w:val="Heading3"/>
+      </w:pPr>
+      <w:r>
+        <w:t>Arcane Diagnostics</w:t>
+      </w:r>
+    </w:p>
+    <w:p>
+      <w:r>
+        <w:t>"The device monitors magical fluctuations and system integrity."</w:t>
+      </w:r>
+    </w:p>
+    <w:p>
+      <w:r>
+        <w:t>The warlock gains detect magic at will while the device is within 30 ft.</w:t>
+      </w:r>
+    </w:p>
+    <w:p>
+      <w:pPr>
+        <w:pStyle w:val="Heading3"/>
+      </w:pPr>
+      <w:r>
+        <w:t>Target Prediction</w:t>
+      </w:r>
+    </w:p>
+    <w:p>
+      <w:r>
+        <w:t>"The device calculates enemy movement before it happens."</w:t>
+      </w:r>
+    </w:p>
+    <w:p>
+      <w:r>
+        <w:t>Once per round, the warlock may gain a +2 insight bonus on an attack roll after seeing the result but before the outcome is declared.</w:t>
+      </w:r>
+    </w:p>
+    <w:p>
+      <w:pPr>
+        <w:pStyle w:val="Heading3"/>
+      </w:pPr>
+      <w:r>
+        <w:t>Overclock Protocol</w:t>
+      </w:r>
+    </w:p>
+    <w:p>
+      <w:r>
+        <w:t>"The device briefly pushes the system beyond safe limits."</w:t>
+      </w:r>
+    </w:p>
+    <w:p>
+      <w:r>
+        <w:t>While in Unison Mode, the warlock gains +10 ft movement speed and +1 to attack rolls for 1 round.</w:t>
+      </w:r>
+    </w:p>
+    <w:p>
+      <w:r>
+        <w:t>This ability may be used once per encounter.</w:t>
+      </w:r>
+    </w:p>
+    <w:p>
+      <w:pPr>
+        <w:pStyle w:val="Heading3"/>
+      </w:pPr>
+      <w:r>
+        <w:t>Guardian Protocol</w:t>
+      </w:r>
+    </w:p>
+    <w:p>
+      <w:r>
+        <w:t>"The device instinctively shields its master."</w:t>
+      </w:r>
+    </w:p>
+    <w:p>
+      <w:r>
+        <w:t>If the warlock would take damage while the device is within 10 ft, the device may reduce the damage by an amount equal to the device’s level.</w:t>
+      </w:r>
+    </w:p>
+    <w:p>
+      <w:pPr>
+        <w:pStyle w:val="Heading3"/>
+      </w:pPr>
+      <w:r>
+        <w:t>Emergency Unison</w:t>
+      </w:r>
+    </w:p>
+    <w:p>
+      <w:r>
+        <w:t>"When danger strikes, synchronization occurs instantly."</w:t>
+      </w:r>
+    </w:p>
+    <w:p>
+      <w:r>
+        <w:t>If the warlock is surprised or caught flat-footed, the device may enter Unison Mode as an immediate action.</w:t>
+      </w:r>
+    </w:p>
+    <w:p>
+      <w:pPr>
+        <w:pStyle w:val="Heading3"/>
+      </w:pPr>
+      <w:r>
+        <w:t>Link Stabilization</w:t>
+      </w:r>
+    </w:p>
+    <w:p>
+      <w:r>
+        <w:t>"The bond between master and device becomes harder to break."</w:t>
+      </w:r>
+    </w:p>
+    <w:p>
+      <w:r>
+        <w:t>The warlock gains a +4 bonus on concentration checks while the device is within 30 ft.</w:t>
+      </w:r>
+    </w:p>
+    <w:p>
+      <w:pPr>
+        <w:pStyle w:val="Heading3"/>
+      </w:pPr>
+      <w:r>
+        <w:t>Device Autonomy</w:t>
+      </w:r>
+    </w:p>
+    <w:p>
+      <w:r>
+        <w:t>"The device operates independently when necessary."</w:t>
+      </w:r>
+    </w:p>
+    <w:p>
+      <w:r>
+        <w:t>While in Standby Mode, the device may take move actions and use its talents without requiring commands from the warlock.</w:t>
+      </w:r>
+    </w:p>
+    <w:p>
+      <w:pPr>
+        <w:pStyle w:val="Heading3"/>
+      </w:pPr>
+      <w:r>
+        <w:t>Spectral Armament</w:t>
+      </w:r>
+    </w:p>
+    <w:p>
+      <w:r>
+        <w:t>"The device may project weapons of magical force."</w:t>
+      </w:r>
+    </w:p>
+    <w:p>
+      <w:r>
+        <w:t>While in Standby Mode, the device may make a single ranged attack using the warlock’s caster level as BAB.</w:t>
+      </w:r>
+    </w:p>
+    <w:p>
+      <w:pPr>
+        <w:pStyle w:val="Heading3"/>
+      </w:pPr>
+      <w:r>
+        <w:t>Adaptive Barrier</w:t>
+      </w:r>
+    </w:p>
+    <w:p>
+      <w:r>
+        <w:t>"The defensive field adjusts to incoming threats."</w:t>
+      </w:r>
+    </w:p>
+    <w:p>
+      <w:r>
+        <w:t>When the Unison Barrier absorbs damage, the warlock gains energy resistance 5 against that damage type for 1 round.</w:t>
+      </w:r>
+    </w:p>
+    <w:p>
+      <w:pPr>
+        <w:pStyle w:val="Heading3"/>
+      </w:pPr>
+      <w:r>
+        <w:t>Synchronization Surge</w:t>
+      </w:r>
+    </w:p>
+    <w:p>
+      <w:r>
+        <w:t>"The device channels additional power during Unison."</w:t>
+      </w:r>
+    </w:p>
+    <w:p>
+      <w:r>
+        <w:t>While in Unison Mode, the warlock gains +1 caster level.</w:t>
+      </w:r>
+    </w:p>
+    <w:p>
+      <w:pPr>
+        <w:pStyle w:val="Heading3"/>
+      </w:pPr>
+      <w:r>
+        <w:t>Remote Unison</w:t>
+      </w:r>
+    </w:p>
+    <w:p>
+      <w:r>
+        <w:t>"The device may synchronize from a distance."</w:t>
+      </w:r>
+    </w:p>
+    <w:p>
+      <w:r>
+        <w:t>The Unison Device may enter Unison Mode with a valid host within 60 ft instead of needing to be adjacent.</w:t>
+      </w:r>
+    </w:p>
+    <w:p>
+      <w:pPr>
+        <w:pStyle w:val="Heading3"/>
+      </w:pPr>
+      <w:r>
+        <w:t>Echo Memory</w:t>
+      </w:r>
+    </w:p>
+    <w:p>
+      <w:r>
+        <w:t>"The device records fragments of past battles."</w:t>
+      </w:r>
+    </w:p>
+    <w:p>
+      <w:r>
+        <w:t>Once per day, the warlock may reroll a failed attack roll, saving throw, or skill check.</w:t>
+      </w:r>
+    </w:p>
+    <w:p>
+      <w:pPr>
+        <w:pStyle w:val="Heading3"/>
+      </w:pPr>
+      <w:r>
+        <w:t>Unison Completion Ledger</w:t>
+      </w:r>
+    </w:p>
+    <w:p>
+      <w:r>
+        <w:t>The source repeats Barrier System as Unison Barrier; their same-value temporary hit points are not declared additive. Fast Unison has no recovered definition even though Lightning Unison references it. Unison Boost, Ether Development and Armor appear in the table without completed definitions. Stored-spell capacity, spell-slot/spell-point compatibility, ability DCs, barrier reset timing and Guardian Protocol frequency remain unresolved. Puppet Mode’s automatic activation must be reconciled with Unison ending on unconsciousness. Spectral Armament lacks damage and range. Wolkenritter cohort statistics and host mappings remain GM-dependent. The historical “17 done 11 to go” label is retained as source evidence, not a validated catalogue count.</w:t>
       </w:r>
     </w:p>
     <w:p>
@@ -10485,6 +12658,9 @@
       </w:r>
     </w:p>
     <w:p>
+      <w:pPr>
+        <w:pStyle w:val="Heading3"/>
+      </w:pPr>
       <w:r>
         <w:t>Integrated Class and Bloodline Brand Revision</w:t>
       </w:r>
@@ -10499,12 +12675,7 @@
     </w:p>
     <w:p>
       <w:r>
-        <w:t>This section is part of the revised master. It preserves the complete supplied class document and records the confirmed corrections governing Brand identity, subsystem ownership, and future mechanical completion.</w:t>
-      </w:r>
-    </w:p>
-    <w:p>
-      <w:r>
-        <w:t>Source limitation: the supplied Night Monarch PDF itself replaces the full Asura, Jaguar Sun, Rakshasa, and Unison Device talent text with references to an unavailable original document. Those missing rules are not invented here.</w:t>
+        <w:t>This section is part of the revised master. It preserves the complete supplied class document and records the confirmed corrections governing Brand identity, subsystem ownership, and future mechanical completion. Source limitation: the supplied Night Monarch PDF itself replaces the full Asura, Jaguar Sun, Rakshasa, and Unison Device talent text with references to an unavailable original document. Those missing rules are not invented here.</w:t>
       </w:r>
     </w:p>
     <w:p>
@@ -10637,7 +12808,7 @@
     </w:p>
     <w:p>
       <w:r>
-        <w:t>A general mechanical angel and weapons platform. Ikaros anchors the concept only. Hsien-Ko is the controlling anchor. The Brand uses Martial progression; Unquiet Grave is a core favored discipline, with additional disciplines supporting oversized weapons, mobility, and chi techniques.</w:t>
+        <w:t>A general mechanical angel and weapons platform. Ikaros anchors the concept only.</w:t>
       </w:r>
     </w:p>
     <w:p>
@@ -10645,6 +12816,32 @@
         <w:pStyle w:val="Heading3"/>
       </w:pPr>
       <w:r>
+        <w:t>Banshee</w:t>
+      </w:r>
+    </w:p>
+    <w:p>
+      <w:r>
+        <w:t>A dark windrunner/banshee archer. Sylvanas anchors the combat concept, not personality or biography.</w:t>
+      </w:r>
+    </w:p>
+    <w:p>
+      <w:pPr>
+        <w:pStyle w:val="Heading3"/>
+      </w:pPr>
+      <w:r>
+        <w:t>Jiangshi</w:t>
+      </w:r>
+    </w:p>
+    <w:p>
+      <w:r>
+        <w:t>Hsien-Ko is the controlling anchor. The Brand uses Martial progression; Unquiet Grave is a core favored discipline, with additional disciplines supporting oversized weapons, mobility, and chi techniques.</w:t>
+      </w:r>
+    </w:p>
+    <w:p>
+      <w:pPr>
+        <w:pStyle w:val="Heading3"/>
+      </w:pPr>
+      <w:r>
         <w:t>Kitsune</w:t>
       </w:r>
     </w:p>
@@ -10814,6 +13011,19 @@
         <w:pStyle w:val="Heading3"/>
       </w:pPr>
       <w:r>
+        <w:t>Mummy Lord</w:t>
+      </w:r>
+    </w:p>
+    <w:p>
+      <w:r>
+        <w:t>Menace supplies presentation, personality, and living-scarf combat; Astarte supplies sovereign authority and mandate mechanics.</w:t>
+      </w:r>
+    </w:p>
+    <w:p>
+      <w:pPr>
+        <w:pStyle w:val="Heading3"/>
+      </w:pPr>
+      <w:r>
         <w:t>Yuki-onna</w:t>
       </w:r>
     </w:p>
@@ -10923,7 +13133,7 @@
     </w:p>
     <w:p>
       <w:r>
-        <w:t>These are design tasks rather than unanswered identity questions: choose Jiangshi's remaining favored disciplines; expand Yuki-onna and Tengu talent lists; complete Oni Sphere integration through Oni Magic; and recover or reconstruct the omitted Unison Device and Martial Brand talent text from the original source when available.</w:t>
+        <w:t>These remain design tasks: choose Jiangshi’s remaining favored disciplines; expand Yuki-onna and Tengu; complete Oni Magic integration; resolve the recovered Unison adapter’s interfaces. Martial catalogue recovery is now completed.</w:t>
       </w:r>
     </w:p>
     <w:p>
@@ -10936,6 +13146,2274 @@
         <w:pStyle w:val="Heading1"/>
       </w:pPr>
       <w:r>
+        <w:t>Genie — Donor Reference</w:t>
+      </w:r>
+    </w:p>
+    <w:p>
+      <w:r>
+        <w:t>Genie belongs to the Sand Monarch and remains cut as a Night Monarch Brand. This appendix preserves the recovered owning subsystem to audit references such as Angeloid’s copied Genie wording; it does not grant a new companion or any Genie talent. Source terminology, numerical conflicts and name-only options remain visible.</w:t>
+      </w:r>
+    </w:p>
+    <w:p>
+      <w:pPr>
+        <w:pStyle w:val="Heading3"/>
+      </w:pPr>
+      <w:r>
+        <w:t>Genie — Source Baseline</w:t>
+      </w:r>
+    </w:p>
+    <w:tbl>
+      <w:tblPr>
+        <w:tblStyle w:val="LightShading-Accent1"/>
+        <w:tblW w:type="auto" w:w="0"/>
+        <w:tblLook w:firstColumn="1" w:firstRow="1" w:lastColumn="0" w:lastRow="0" w:noHBand="0" w:noVBand="1" w:val="04A0"/>
+      </w:tblPr>
+      <w:tblGrid>
+        <w:gridCol w:w="5112"/>
+        <w:gridCol w:w="5112"/>
+      </w:tblGrid>
+      <w:tr>
+        <w:tc>
+          <w:tcPr>
+            <w:tcW w:type="dxa" w:w="5112"/>
+          </w:tcPr>
+          <w:p>
+            <w:r>
+              <w:t>Appearance</w:t>
+            </w:r>
+          </w:p>
+        </w:tc>
+        <w:tc>
+          <w:tcPr>
+            <w:tcW w:type="dxa" w:w="5112"/>
+          </w:tcPr>
+          <w:p>
+            <w:r>
+              <w:t>Always humanoid; specifics defined by player and GM at creation</w:t>
+            </w:r>
+          </w:p>
+        </w:tc>
+      </w:tr>
+      <w:tr>
+        <w:tc>
+          <w:tcPr>
+            <w:tcW w:type="dxa" w:w="5112"/>
+          </w:tcPr>
+          <w:p>
+            <w:r>
+              <w:t>Stat Block</w:t>
+            </w:r>
+          </w:p>
+        </w:tc>
+        <w:tc>
+          <w:tcPr>
+            <w:tcW w:type="dxa" w:w="5112"/>
+          </w:tcPr>
+          <w:p>
+            <w:r>
+              <w:t>Independent creature — own stats, not derived from the Monarch</w:t>
+            </w:r>
+          </w:p>
+        </w:tc>
+      </w:tr>
+      <w:tr>
+        <w:tc>
+          <w:tcPr>
+            <w:tcW w:type="dxa" w:w="5112"/>
+          </w:tcPr>
+          <w:p>
+            <w:r>
+              <w:t>Saving Throws</w:t>
+            </w:r>
+          </w:p>
+        </w:tc>
+        <w:tc>
+          <w:tcPr>
+            <w:tcW w:type="dxa" w:w="5112"/>
+          </w:tcPr>
+          <w:p>
+            <w:r>
+              <w:t>Uses the Sand Monarch's save bonuses</w:t>
+            </w:r>
+          </w:p>
+        </w:tc>
+      </w:tr>
+      <w:tr>
+        <w:tc>
+          <w:tcPr>
+            <w:tcW w:type="dxa" w:w="5112"/>
+          </w:tcPr>
+          <w:p>
+            <w:r>
+              <w:t>Hit Dice</w:t>
+            </w:r>
+          </w:p>
+        </w:tc>
+        <w:tc>
+          <w:tcPr>
+            <w:tcW w:type="dxa" w:w="5112"/>
+          </w:tcPr>
+          <w:p>
+            <w:r>
+              <w:t>Scales with level (see progression table)</w:t>
+            </w:r>
+          </w:p>
+        </w:tc>
+      </w:tr>
+      <w:tr>
+        <w:tc>
+          <w:tcPr>
+            <w:tcW w:type="dxa" w:w="5112"/>
+          </w:tcPr>
+          <w:p>
+            <w:r>
+              <w:t>Combat Initiative</w:t>
+            </w:r>
+          </w:p>
+        </w:tc>
+        <w:tc>
+          <w:tcPr>
+            <w:tcW w:type="dxa" w:w="5112"/>
+          </w:tcPr>
+          <w:p>
+            <w:r>
+              <w:t>Acts on the Monarch's turn; no separate initiative</w:t>
+            </w:r>
+          </w:p>
+        </w:tc>
+      </w:tr>
+      <w:tr>
+        <w:tc>
+          <w:tcPr>
+            <w:tcW w:type="dxa" w:w="5112"/>
+          </w:tcPr>
+          <w:p>
+            <w:r>
+              <w:t>Languages</w:t>
+            </w:r>
+          </w:p>
+        </w:tc>
+        <w:tc>
+          <w:tcPr>
+            <w:tcW w:type="dxa" w:w="5112"/>
+          </w:tcPr>
+          <w:p>
+            <w:r>
+              <w:t>Speaks all languages the Monarch knows</w:t>
+            </w:r>
+          </w:p>
+        </w:tc>
+      </w:tr>
+      <w:tr>
+        <w:tc>
+          <w:tcPr>
+            <w:tcW w:type="dxa" w:w="5112"/>
+          </w:tcPr>
+          <w:p>
+            <w:r>
+              <w:t>Communication</w:t>
+            </w:r>
+          </w:p>
+        </w:tc>
+        <w:tc>
+          <w:tcPr>
+            <w:tcW w:type="dxa" w:w="5112"/>
+          </w:tcPr>
+          <w:p>
+            <w:r>
+              <w:t>Full speech — social, tactical, and personal</w:t>
+            </w:r>
+          </w:p>
+        </w:tc>
+      </w:tr>
+      <w:tr>
+        <w:tc>
+          <w:tcPr>
+            <w:tcW w:type="dxa" w:w="5112"/>
+          </w:tcPr>
+          <w:p>
+            <w:r>
+              <w:t>Manifestation</w:t>
+            </w:r>
+          </w:p>
+        </w:tc>
+        <w:tc>
+          <w:tcPr>
+            <w:tcW w:type="dxa" w:w="5112"/>
+          </w:tcPr>
+          <w:p>
+            <w:r>
+              <w:t>Always present by default; retreats to vessel as a swift action</w:t>
+            </w:r>
+          </w:p>
+        </w:tc>
+      </w:tr>
+      <w:tr>
+        <w:tc>
+          <w:tcPr>
+            <w:tcW w:type="dxa" w:w="5112"/>
+          </w:tcPr>
+          <w:p>
+            <w:r>
+              <w:t>Vessel</w:t>
+            </w:r>
+          </w:p>
+        </w:tc>
+        <w:tc>
+          <w:tcPr>
+            <w:tcW w:type="dxa" w:w="5112"/>
+          </w:tcPr>
+          <w:p>
+            <w:r>
+              <w:t>A ring, lamp, talisman, or similar object chosen at 1st level</w:t>
+            </w:r>
+          </w:p>
+        </w:tc>
+      </w:tr>
+      <w:tr>
+        <w:tc>
+          <w:tcPr>
+            <w:tcW w:type="dxa" w:w="5112"/>
+          </w:tcPr>
+          <w:p>
+            <w:r>
+              <w:t>Elemental Affinity</w:t>
+            </w:r>
+          </w:p>
+        </w:tc>
+        <w:tc>
+          <w:tcPr>
+            <w:tcW w:type="dxa" w:w="5112"/>
+          </w:tcPr>
+          <w:p>
+            <w:r>
+              <w:t>Chosen at 3rd level (fire, cold, electricity, or acid)</w:t>
+            </w:r>
+          </w:p>
+        </w:tc>
+      </w:tr>
+    </w:tbl>
+    <w:p>
+      <w:pPr>
+        <w:pStyle w:val="Heading3"/>
+      </w:pPr>
+      <w:r>
+        <w:t>Genie — Donor Progression</w:t>
+      </w:r>
+    </w:p>
+    <w:tbl>
+      <w:tblPr>
+        <w:tblStyle w:val="LightShading-Accent1"/>
+        <w:tblW w:type="auto" w:w="0"/>
+        <w:tblLook w:firstColumn="1" w:firstRow="1" w:lastColumn="0" w:lastRow="0" w:noHBand="0" w:noVBand="1" w:val="04A0"/>
+      </w:tblPr>
+      <w:tblGrid>
+        <w:gridCol w:w="1704"/>
+        <w:gridCol w:w="1704"/>
+        <w:gridCol w:w="1704"/>
+        <w:gridCol w:w="1704"/>
+        <w:gridCol w:w="1704"/>
+        <w:gridCol w:w="1704"/>
+      </w:tblGrid>
+      <w:tr>
+        <w:tc>
+          <w:tcPr>
+            <w:tcW w:type="dxa" w:w="1704"/>
+          </w:tcPr>
+          <w:p>
+            <w:r>
+              <w:t>Level</w:t>
+            </w:r>
+          </w:p>
+        </w:tc>
+        <w:tc>
+          <w:tcPr>
+            <w:tcW w:type="dxa" w:w="1704"/>
+          </w:tcPr>
+          <w:p>
+            <w:r>
+              <w:t>Hit Dice</w:t>
+            </w:r>
+          </w:p>
+        </w:tc>
+        <w:tc>
+          <w:tcPr>
+            <w:tcW w:type="dxa" w:w="1704"/>
+          </w:tcPr>
+          <w:p>
+            <w:r>
+              <w:t>Special</w:t>
+            </w:r>
+          </w:p>
+        </w:tc>
+        <w:tc>
+          <w:tcPr>
+            <w:tcW w:type="dxa" w:w="1704"/>
+          </w:tcPr>
+          <w:p>
+            <w:r>
+              <w:t>Str/Dex Boost</w:t>
+            </w:r>
+          </w:p>
+        </w:tc>
+        <w:tc>
+          <w:tcPr>
+            <w:tcW w:type="dxa" w:w="1704"/>
+          </w:tcPr>
+          <w:p>
+            <w:r>
+              <w:t>Talents</w:t>
+            </w:r>
+          </w:p>
+        </w:tc>
+        <w:tc>
+          <w:tcPr>
+            <w:tcW w:type="dxa" w:w="1704"/>
+          </w:tcPr>
+          <w:p>
+            <w:r>
+              <w:t>Elements</w:t>
+            </w:r>
+          </w:p>
+        </w:tc>
+      </w:tr>
+      <w:tr>
+        <w:tc>
+          <w:tcPr>
+            <w:tcW w:type="dxa" w:w="1704"/>
+          </w:tcPr>
+          <w:p>
+            <w:r>
+              <w:t>1st</w:t>
+            </w:r>
+          </w:p>
+        </w:tc>
+        <w:tc>
+          <w:tcPr>
+            <w:tcW w:type="dxa" w:w="1704"/>
+          </w:tcPr>
+          <w:p>
+            <w:r>
+              <w:t>1</w:t>
+            </w:r>
+          </w:p>
+        </w:tc>
+        <w:tc>
+          <w:tcPr>
+            <w:tcW w:type="dxa" w:w="1704"/>
+          </w:tcPr>
+          <w:p>
+            <w:r>
+              <w:t>Genie's Bounty, Spiritual Development, Alertness</w:t>
+            </w:r>
+          </w:p>
+        </w:tc>
+        <w:tc>
+          <w:tcPr>
+            <w:tcW w:type="dxa" w:w="1704"/>
+          </w:tcPr>
+          <w:p>
+            <w:r>
+              <w:t>—</w:t>
+            </w:r>
+          </w:p>
+        </w:tc>
+        <w:tc>
+          <w:tcPr>
+            <w:tcW w:type="dxa" w:w="1704"/>
+          </w:tcPr>
+          <w:p>
+            <w:r>
+              <w:t>2</w:t>
+            </w:r>
+          </w:p>
+        </w:tc>
+        <w:tc>
+          <w:tcPr>
+            <w:tcW w:type="dxa" w:w="1704"/>
+          </w:tcPr>
+          <w:p>
+            <w:r>
+              <w:t>—</w:t>
+            </w:r>
+          </w:p>
+        </w:tc>
+      </w:tr>
+      <w:tr>
+        <w:tc>
+          <w:tcPr>
+            <w:tcW w:type="dxa" w:w="1704"/>
+          </w:tcPr>
+          <w:p>
+            <w:r>
+              <w:t>2nd</w:t>
+            </w:r>
+          </w:p>
+        </w:tc>
+        <w:tc>
+          <w:tcPr>
+            <w:tcW w:type="dxa" w:w="1704"/>
+          </w:tcPr>
+          <w:p>
+            <w:r>
+              <w:t>1</w:t>
+            </w:r>
+          </w:p>
+        </w:tc>
+        <w:tc>
+          <w:tcPr>
+            <w:tcW w:type="dxa" w:w="1704"/>
+          </w:tcPr>
+          <w:p>
+            <w:r>
+              <w:t>Genie Talent</w:t>
+            </w:r>
+          </w:p>
+        </w:tc>
+        <w:tc>
+          <w:tcPr>
+            <w:tcW w:type="dxa" w:w="1704"/>
+          </w:tcPr>
+          <w:p>
+            <w:r>
+              <w:t>—</w:t>
+            </w:r>
+          </w:p>
+        </w:tc>
+        <w:tc>
+          <w:tcPr>
+            <w:tcW w:type="dxa" w:w="1704"/>
+          </w:tcPr>
+          <w:p>
+            <w:r>
+              <w:t>3</w:t>
+            </w:r>
+          </w:p>
+        </w:tc>
+        <w:tc>
+          <w:tcPr>
+            <w:tcW w:type="dxa" w:w="1704"/>
+          </w:tcPr>
+          <w:p>
+            <w:r>
+              <w:t>1</w:t>
+            </w:r>
+          </w:p>
+        </w:tc>
+      </w:tr>
+      <w:tr>
+        <w:tc>
+          <w:tcPr>
+            <w:tcW w:type="dxa" w:w="1704"/>
+          </w:tcPr>
+          <w:p>
+            <w:r>
+              <w:t>3rd</w:t>
+            </w:r>
+          </w:p>
+        </w:tc>
+        <w:tc>
+          <w:tcPr>
+            <w:tcW w:type="dxa" w:w="1704"/>
+          </w:tcPr>
+          <w:p>
+            <w:r>
+              <w:t>2</w:t>
+            </w:r>
+          </w:p>
+        </w:tc>
+        <w:tc>
+          <w:tcPr>
+            <w:tcW w:type="dxa" w:w="1704"/>
+          </w:tcPr>
+          <w:p>
+            <w:r>
+              <w:t>Cultivated Power</w:t>
+            </w:r>
+          </w:p>
+        </w:tc>
+        <w:tc>
+          <w:tcPr>
+            <w:tcW w:type="dxa" w:w="1704"/>
+          </w:tcPr>
+          <w:p>
+            <w:r>
+              <w:t>+0</w:t>
+            </w:r>
+          </w:p>
+        </w:tc>
+        <w:tc>
+          <w:tcPr>
+            <w:tcW w:type="dxa" w:w="1704"/>
+          </w:tcPr>
+          <w:p>
+            <w:r>
+              <w:t>3</w:t>
+            </w:r>
+          </w:p>
+        </w:tc>
+        <w:tc>
+          <w:tcPr>
+            <w:tcW w:type="dxa" w:w="1704"/>
+          </w:tcPr>
+          <w:p>
+            <w:r>
+              <w:t>1</w:t>
+            </w:r>
+          </w:p>
+        </w:tc>
+      </w:tr>
+      <w:tr>
+        <w:tc>
+          <w:tcPr>
+            <w:tcW w:type="dxa" w:w="1704"/>
+          </w:tcPr>
+          <w:p>
+            <w:r>
+              <w:t>4th</w:t>
+            </w:r>
+          </w:p>
+        </w:tc>
+        <w:tc>
+          <w:tcPr>
+            <w:tcW w:type="dxa" w:w="1704"/>
+          </w:tcPr>
+          <w:p>
+            <w:r>
+              <w:t>3</w:t>
+            </w:r>
+          </w:p>
+        </w:tc>
+        <w:tc>
+          <w:tcPr>
+            <w:tcW w:type="dxa" w:w="1704"/>
+          </w:tcPr>
+          <w:p>
+            <w:r>
+              <w:t>Genie Talent</w:t>
+            </w:r>
+          </w:p>
+        </w:tc>
+        <w:tc>
+          <w:tcPr>
+            <w:tcW w:type="dxa" w:w="1704"/>
+          </w:tcPr>
+          <w:p>
+            <w:r>
+              <w:t>+0</w:t>
+            </w:r>
+          </w:p>
+        </w:tc>
+        <w:tc>
+          <w:tcPr>
+            <w:tcW w:type="dxa" w:w="1704"/>
+          </w:tcPr>
+          <w:p>
+            <w:r>
+              <w:t>4</w:t>
+            </w:r>
+          </w:p>
+        </w:tc>
+        <w:tc>
+          <w:tcPr>
+            <w:tcW w:type="dxa" w:w="1704"/>
+          </w:tcPr>
+          <w:p>
+            <w:r>
+              <w:t>1</w:t>
+            </w:r>
+          </w:p>
+        </w:tc>
+      </w:tr>
+      <w:tr>
+        <w:tc>
+          <w:tcPr>
+            <w:tcW w:type="dxa" w:w="1704"/>
+          </w:tcPr>
+          <w:p>
+            <w:r>
+              <w:t>5th</w:t>
+            </w:r>
+          </w:p>
+        </w:tc>
+        <w:tc>
+          <w:tcPr>
+            <w:tcW w:type="dxa" w:w="1704"/>
+          </w:tcPr>
+          <w:p>
+            <w:r>
+              <w:t>3</w:t>
+            </w:r>
+          </w:p>
+        </w:tc>
+        <w:tc>
+          <w:tcPr>
+            <w:tcW w:type="dxa" w:w="1704"/>
+          </w:tcPr>
+          <w:p>
+            <w:r>
+              <w:t>—</w:t>
+            </w:r>
+          </w:p>
+        </w:tc>
+        <w:tc>
+          <w:tcPr>
+            <w:tcW w:type="dxa" w:w="1704"/>
+          </w:tcPr>
+          <w:p>
+            <w:r>
+              <w:t>+2</w:t>
+            </w:r>
+          </w:p>
+        </w:tc>
+        <w:tc>
+          <w:tcPr>
+            <w:tcW w:type="dxa" w:w="1704"/>
+          </w:tcPr>
+          <w:p>
+            <w:r>
+              <w:t>4</w:t>
+            </w:r>
+          </w:p>
+        </w:tc>
+        <w:tc>
+          <w:tcPr>
+            <w:tcW w:type="dxa" w:w="1704"/>
+          </w:tcPr>
+          <w:p>
+            <w:r>
+              <w:t>2</w:t>
+            </w:r>
+          </w:p>
+        </w:tc>
+      </w:tr>
+      <w:tr>
+        <w:tc>
+          <w:tcPr>
+            <w:tcW w:type="dxa" w:w="1704"/>
+          </w:tcPr>
+          <w:p>
+            <w:r>
+              <w:t>6th</w:t>
+            </w:r>
+          </w:p>
+        </w:tc>
+        <w:tc>
+          <w:tcPr>
+            <w:tcW w:type="dxa" w:w="1704"/>
+          </w:tcPr>
+          <w:p>
+            <w:r>
+              <w:t>4</w:t>
+            </w:r>
+          </w:p>
+        </w:tc>
+        <w:tc>
+          <w:tcPr>
+            <w:tcW w:type="dxa" w:w="1704"/>
+          </w:tcPr>
+          <w:p>
+            <w:r>
+              <w:t>Genie Talent</w:t>
+            </w:r>
+          </w:p>
+        </w:tc>
+        <w:tc>
+          <w:tcPr>
+            <w:tcW w:type="dxa" w:w="1704"/>
+          </w:tcPr>
+          <w:p>
+            <w:r>
+              <w:t>+2</w:t>
+            </w:r>
+          </w:p>
+        </w:tc>
+        <w:tc>
+          <w:tcPr>
+            <w:tcW w:type="dxa" w:w="1704"/>
+          </w:tcPr>
+          <w:p>
+            <w:r>
+              <w:t>5</w:t>
+            </w:r>
+          </w:p>
+        </w:tc>
+        <w:tc>
+          <w:tcPr>
+            <w:tcW w:type="dxa" w:w="1704"/>
+          </w:tcPr>
+          <w:p>
+            <w:r>
+              <w:t>2</w:t>
+            </w:r>
+          </w:p>
+        </w:tc>
+      </w:tr>
+      <w:tr>
+        <w:tc>
+          <w:tcPr>
+            <w:tcW w:type="dxa" w:w="1704"/>
+          </w:tcPr>
+          <w:p>
+            <w:r>
+              <w:t>7th</w:t>
+            </w:r>
+          </w:p>
+        </w:tc>
+        <w:tc>
+          <w:tcPr>
+            <w:tcW w:type="dxa" w:w="1704"/>
+          </w:tcPr>
+          <w:p>
+            <w:r>
+              <w:t>5</w:t>
+            </w:r>
+          </w:p>
+        </w:tc>
+        <w:tc>
+          <w:tcPr>
+            <w:tcW w:type="dxa" w:w="1704"/>
+          </w:tcPr>
+          <w:p>
+            <w:r>
+              <w:t>—</w:t>
+            </w:r>
+          </w:p>
+        </w:tc>
+        <w:tc>
+          <w:tcPr>
+            <w:tcW w:type="dxa" w:w="1704"/>
+          </w:tcPr>
+          <w:p>
+            <w:r>
+              <w:t>+2</w:t>
+            </w:r>
+          </w:p>
+        </w:tc>
+        <w:tc>
+          <w:tcPr>
+            <w:tcW w:type="dxa" w:w="1704"/>
+          </w:tcPr>
+          <w:p>
+            <w:r>
+              <w:t>5</w:t>
+            </w:r>
+          </w:p>
+        </w:tc>
+        <w:tc>
+          <w:tcPr>
+            <w:tcW w:type="dxa" w:w="1704"/>
+          </w:tcPr>
+          <w:p>
+            <w:r>
+              <w:t>2</w:t>
+            </w:r>
+          </w:p>
+        </w:tc>
+      </w:tr>
+      <w:tr>
+        <w:tc>
+          <w:tcPr>
+            <w:tcW w:type="dxa" w:w="1704"/>
+          </w:tcPr>
+          <w:p>
+            <w:r>
+              <w:t>8th</w:t>
+            </w:r>
+          </w:p>
+        </w:tc>
+        <w:tc>
+          <w:tcPr>
+            <w:tcW w:type="dxa" w:w="1704"/>
+          </w:tcPr>
+          <w:p>
+            <w:r>
+              <w:t>6</w:t>
+            </w:r>
+          </w:p>
+        </w:tc>
+        <w:tc>
+          <w:tcPr>
+            <w:tcW w:type="dxa" w:w="1704"/>
+          </w:tcPr>
+          <w:p>
+            <w:r>
+              <w:t>Genie Talent</w:t>
+            </w:r>
+          </w:p>
+        </w:tc>
+        <w:tc>
+          <w:tcPr>
+            <w:tcW w:type="dxa" w:w="1704"/>
+          </w:tcPr>
+          <w:p>
+            <w:r>
+              <w:t>+2</w:t>
+            </w:r>
+          </w:p>
+        </w:tc>
+        <w:tc>
+          <w:tcPr>
+            <w:tcW w:type="dxa" w:w="1704"/>
+          </w:tcPr>
+          <w:p>
+            <w:r>
+              <w:t>6</w:t>
+            </w:r>
+          </w:p>
+        </w:tc>
+        <w:tc>
+          <w:tcPr>
+            <w:tcW w:type="dxa" w:w="1704"/>
+          </w:tcPr>
+          <w:p>
+            <w:r>
+              <w:t>2</w:t>
+            </w:r>
+          </w:p>
+        </w:tc>
+      </w:tr>
+      <w:tr>
+        <w:tc>
+          <w:tcPr>
+            <w:tcW w:type="dxa" w:w="1704"/>
+          </w:tcPr>
+          <w:p>
+            <w:r>
+              <w:t>9th</w:t>
+            </w:r>
+          </w:p>
+        </w:tc>
+        <w:tc>
+          <w:tcPr>
+            <w:tcW w:type="dxa" w:w="1704"/>
+          </w:tcPr>
+          <w:p>
+            <w:r>
+              <w:t>6</w:t>
+            </w:r>
+          </w:p>
+        </w:tc>
+        <w:tc>
+          <w:tcPr>
+            <w:tcW w:type="dxa" w:w="1704"/>
+          </w:tcPr>
+          <w:p>
+            <w:r>
+              <w:t>—</w:t>
+            </w:r>
+          </w:p>
+        </w:tc>
+        <w:tc>
+          <w:tcPr>
+            <w:tcW w:type="dxa" w:w="1704"/>
+          </w:tcPr>
+          <w:p>
+            <w:r>
+              <w:t>+4</w:t>
+            </w:r>
+          </w:p>
+        </w:tc>
+        <w:tc>
+          <w:tcPr>
+            <w:tcW w:type="dxa" w:w="1704"/>
+          </w:tcPr>
+          <w:p>
+            <w:r>
+              <w:t>6</w:t>
+            </w:r>
+          </w:p>
+        </w:tc>
+        <w:tc>
+          <w:tcPr>
+            <w:tcW w:type="dxa" w:w="1704"/>
+          </w:tcPr>
+          <w:p>
+            <w:r>
+              <w:t>3</w:t>
+            </w:r>
+          </w:p>
+        </w:tc>
+      </w:tr>
+      <w:tr>
+        <w:tc>
+          <w:tcPr>
+            <w:tcW w:type="dxa" w:w="1704"/>
+          </w:tcPr>
+          <w:p>
+            <w:r>
+              <w:t>10th</w:t>
+            </w:r>
+          </w:p>
+        </w:tc>
+        <w:tc>
+          <w:tcPr>
+            <w:tcW w:type="dxa" w:w="1704"/>
+          </w:tcPr>
+          <w:p>
+            <w:r>
+              <w:t>7</w:t>
+            </w:r>
+          </w:p>
+        </w:tc>
+        <w:tc>
+          <w:tcPr>
+            <w:tcW w:type="dxa" w:w="1704"/>
+          </w:tcPr>
+          <w:p>
+            <w:r>
+              <w:t>Genie Talent</w:t>
+            </w:r>
+          </w:p>
+        </w:tc>
+        <w:tc>
+          <w:tcPr>
+            <w:tcW w:type="dxa" w:w="1704"/>
+          </w:tcPr>
+          <w:p>
+            <w:r>
+              <w:t>+4</w:t>
+            </w:r>
+          </w:p>
+        </w:tc>
+        <w:tc>
+          <w:tcPr>
+            <w:tcW w:type="dxa" w:w="1704"/>
+          </w:tcPr>
+          <w:p>
+            <w:r>
+              <w:t>7</w:t>
+            </w:r>
+          </w:p>
+        </w:tc>
+        <w:tc>
+          <w:tcPr>
+            <w:tcW w:type="dxa" w:w="1704"/>
+          </w:tcPr>
+          <w:p>
+            <w:r>
+              <w:t>3</w:t>
+            </w:r>
+          </w:p>
+        </w:tc>
+      </w:tr>
+      <w:tr>
+        <w:tc>
+          <w:tcPr>
+            <w:tcW w:type="dxa" w:w="1704"/>
+          </w:tcPr>
+          <w:p>
+            <w:r>
+              <w:t>11th</w:t>
+            </w:r>
+          </w:p>
+        </w:tc>
+        <w:tc>
+          <w:tcPr>
+            <w:tcW w:type="dxa" w:w="1704"/>
+          </w:tcPr>
+          <w:p>
+            <w:r>
+              <w:t>8</w:t>
+            </w:r>
+          </w:p>
+        </w:tc>
+        <w:tc>
+          <w:tcPr>
+            <w:tcW w:type="dxa" w:w="1704"/>
+          </w:tcPr>
+          <w:p>
+            <w:r>
+              <w:t>—</w:t>
+            </w:r>
+          </w:p>
+        </w:tc>
+        <w:tc>
+          <w:tcPr>
+            <w:tcW w:type="dxa" w:w="1704"/>
+          </w:tcPr>
+          <w:p>
+            <w:r>
+              <w:t>+4</w:t>
+            </w:r>
+          </w:p>
+        </w:tc>
+        <w:tc>
+          <w:tcPr>
+            <w:tcW w:type="dxa" w:w="1704"/>
+          </w:tcPr>
+          <w:p>
+            <w:r>
+              <w:t>7</w:t>
+            </w:r>
+          </w:p>
+        </w:tc>
+        <w:tc>
+          <w:tcPr>
+            <w:tcW w:type="dxa" w:w="1704"/>
+          </w:tcPr>
+          <w:p>
+            <w:r>
+              <w:t>3</w:t>
+            </w:r>
+          </w:p>
+        </w:tc>
+      </w:tr>
+      <w:tr>
+        <w:tc>
+          <w:tcPr>
+            <w:tcW w:type="dxa" w:w="1704"/>
+          </w:tcPr>
+          <w:p>
+            <w:r>
+              <w:t>12th</w:t>
+            </w:r>
+          </w:p>
+        </w:tc>
+        <w:tc>
+          <w:tcPr>
+            <w:tcW w:type="dxa" w:w="1704"/>
+          </w:tcPr>
+          <w:p>
+            <w:r>
+              <w:t>9</w:t>
+            </w:r>
+          </w:p>
+        </w:tc>
+        <w:tc>
+          <w:tcPr>
+            <w:tcW w:type="dxa" w:w="1704"/>
+          </w:tcPr>
+          <w:p>
+            <w:r>
+              <w:t>Genie Talent</w:t>
+            </w:r>
+          </w:p>
+        </w:tc>
+        <w:tc>
+          <w:tcPr>
+            <w:tcW w:type="dxa" w:w="1704"/>
+          </w:tcPr>
+          <w:p>
+            <w:r>
+              <w:t>+4</w:t>
+            </w:r>
+          </w:p>
+        </w:tc>
+        <w:tc>
+          <w:tcPr>
+            <w:tcW w:type="dxa" w:w="1704"/>
+          </w:tcPr>
+          <w:p>
+            <w:r>
+              <w:t>8</w:t>
+            </w:r>
+          </w:p>
+        </w:tc>
+        <w:tc>
+          <w:tcPr>
+            <w:tcW w:type="dxa" w:w="1704"/>
+          </w:tcPr>
+          <w:p>
+            <w:r>
+              <w:t>4</w:t>
+            </w:r>
+          </w:p>
+        </w:tc>
+      </w:tr>
+      <w:tr>
+        <w:tc>
+          <w:tcPr>
+            <w:tcW w:type="dxa" w:w="1704"/>
+          </w:tcPr>
+          <w:p>
+            <w:r>
+              <w:t>13th</w:t>
+            </w:r>
+          </w:p>
+        </w:tc>
+        <w:tc>
+          <w:tcPr>
+            <w:tcW w:type="dxa" w:w="1704"/>
+          </w:tcPr>
+          <w:p>
+            <w:r>
+              <w:t>9</w:t>
+            </w:r>
+          </w:p>
+        </w:tc>
+        <w:tc>
+          <w:tcPr>
+            <w:tcW w:type="dxa" w:w="1704"/>
+          </w:tcPr>
+          <w:p>
+            <w:r>
+              <w:t>—</w:t>
+            </w:r>
+          </w:p>
+        </w:tc>
+        <w:tc>
+          <w:tcPr>
+            <w:tcW w:type="dxa" w:w="1704"/>
+          </w:tcPr>
+          <w:p>
+            <w:r>
+              <w:t>+6</w:t>
+            </w:r>
+          </w:p>
+        </w:tc>
+        <w:tc>
+          <w:tcPr>
+            <w:tcW w:type="dxa" w:w="1704"/>
+          </w:tcPr>
+          <w:p>
+            <w:r>
+              <w:t>8</w:t>
+            </w:r>
+          </w:p>
+        </w:tc>
+        <w:tc>
+          <w:tcPr>
+            <w:tcW w:type="dxa" w:w="1704"/>
+          </w:tcPr>
+          <w:p>
+            <w:r>
+              <w:t>4</w:t>
+            </w:r>
+          </w:p>
+        </w:tc>
+      </w:tr>
+      <w:tr>
+        <w:tc>
+          <w:tcPr>
+            <w:tcW w:type="dxa" w:w="1704"/>
+          </w:tcPr>
+          <w:p>
+            <w:r>
+              <w:t>14th</w:t>
+            </w:r>
+          </w:p>
+        </w:tc>
+        <w:tc>
+          <w:tcPr>
+            <w:tcW w:type="dxa" w:w="1704"/>
+          </w:tcPr>
+          <w:p>
+            <w:r>
+              <w:t>10</w:t>
+            </w:r>
+          </w:p>
+        </w:tc>
+        <w:tc>
+          <w:tcPr>
+            <w:tcW w:type="dxa" w:w="1704"/>
+          </w:tcPr>
+          <w:p>
+            <w:r>
+              <w:t>Genie Talent</w:t>
+            </w:r>
+          </w:p>
+        </w:tc>
+        <w:tc>
+          <w:tcPr>
+            <w:tcW w:type="dxa" w:w="1704"/>
+          </w:tcPr>
+          <w:p>
+            <w:r>
+              <w:t>+6</w:t>
+            </w:r>
+          </w:p>
+        </w:tc>
+        <w:tc>
+          <w:tcPr>
+            <w:tcW w:type="dxa" w:w="1704"/>
+          </w:tcPr>
+          <w:p>
+            <w:r>
+              <w:t>9</w:t>
+            </w:r>
+          </w:p>
+        </w:tc>
+        <w:tc>
+          <w:tcPr>
+            <w:tcW w:type="dxa" w:w="1704"/>
+          </w:tcPr>
+          <w:p>
+            <w:r>
+              <w:t>4</w:t>
+            </w:r>
+          </w:p>
+        </w:tc>
+      </w:tr>
+      <w:tr>
+        <w:tc>
+          <w:tcPr>
+            <w:tcW w:type="dxa" w:w="1704"/>
+          </w:tcPr>
+          <w:p>
+            <w:r>
+              <w:t>15th</w:t>
+            </w:r>
+          </w:p>
+        </w:tc>
+        <w:tc>
+          <w:tcPr>
+            <w:tcW w:type="dxa" w:w="1704"/>
+          </w:tcPr>
+          <w:p>
+            <w:r>
+              <w:t>11</w:t>
+            </w:r>
+          </w:p>
+        </w:tc>
+        <w:tc>
+          <w:tcPr>
+            <w:tcW w:type="dxa" w:w="1704"/>
+          </w:tcPr>
+          <w:p>
+            <w:r>
+              <w:t>—</w:t>
+            </w:r>
+          </w:p>
+        </w:tc>
+        <w:tc>
+          <w:tcPr>
+            <w:tcW w:type="dxa" w:w="1704"/>
+          </w:tcPr>
+          <w:p>
+            <w:r>
+              <w:t>+6</w:t>
+            </w:r>
+          </w:p>
+        </w:tc>
+        <w:tc>
+          <w:tcPr>
+            <w:tcW w:type="dxa" w:w="1704"/>
+          </w:tcPr>
+          <w:p>
+            <w:r>
+              <w:t>9</w:t>
+            </w:r>
+          </w:p>
+        </w:tc>
+        <w:tc>
+          <w:tcPr>
+            <w:tcW w:type="dxa" w:w="1704"/>
+          </w:tcPr>
+          <w:p>
+            <w:r>
+              <w:t>5</w:t>
+            </w:r>
+          </w:p>
+        </w:tc>
+      </w:tr>
+      <w:tr>
+        <w:tc>
+          <w:tcPr>
+            <w:tcW w:type="dxa" w:w="1704"/>
+          </w:tcPr>
+          <w:p>
+            <w:r>
+              <w:t>16th</w:t>
+            </w:r>
+          </w:p>
+        </w:tc>
+        <w:tc>
+          <w:tcPr>
+            <w:tcW w:type="dxa" w:w="1704"/>
+          </w:tcPr>
+          <w:p>
+            <w:r>
+              <w:t>12</w:t>
+            </w:r>
+          </w:p>
+        </w:tc>
+        <w:tc>
+          <w:tcPr>
+            <w:tcW w:type="dxa" w:w="1704"/>
+          </w:tcPr>
+          <w:p>
+            <w:r>
+              <w:t>Genie Talent</w:t>
+            </w:r>
+          </w:p>
+        </w:tc>
+        <w:tc>
+          <w:tcPr>
+            <w:tcW w:type="dxa" w:w="1704"/>
+          </w:tcPr>
+          <w:p>
+            <w:r>
+              <w:t>+6</w:t>
+            </w:r>
+          </w:p>
+        </w:tc>
+        <w:tc>
+          <w:tcPr>
+            <w:tcW w:type="dxa" w:w="1704"/>
+          </w:tcPr>
+          <w:p>
+            <w:r>
+              <w:t>10</w:t>
+            </w:r>
+          </w:p>
+        </w:tc>
+        <w:tc>
+          <w:tcPr>
+            <w:tcW w:type="dxa" w:w="1704"/>
+          </w:tcPr>
+          <w:p>
+            <w:r>
+              <w:t>5</w:t>
+            </w:r>
+          </w:p>
+        </w:tc>
+      </w:tr>
+      <w:tr>
+        <w:tc>
+          <w:tcPr>
+            <w:tcW w:type="dxa" w:w="1704"/>
+          </w:tcPr>
+          <w:p>
+            <w:r>
+              <w:t>17th</w:t>
+            </w:r>
+          </w:p>
+        </w:tc>
+        <w:tc>
+          <w:tcPr>
+            <w:tcW w:type="dxa" w:w="1704"/>
+          </w:tcPr>
+          <w:p>
+            <w:r>
+              <w:t>12</w:t>
+            </w:r>
+          </w:p>
+        </w:tc>
+        <w:tc>
+          <w:tcPr>
+            <w:tcW w:type="dxa" w:w="1704"/>
+          </w:tcPr>
+          <w:p>
+            <w:r>
+              <w:t>—</w:t>
+            </w:r>
+          </w:p>
+        </w:tc>
+        <w:tc>
+          <w:tcPr>
+            <w:tcW w:type="dxa" w:w="1704"/>
+          </w:tcPr>
+          <w:p>
+            <w:r>
+              <w:t>+8</w:t>
+            </w:r>
+          </w:p>
+        </w:tc>
+        <w:tc>
+          <w:tcPr>
+            <w:tcW w:type="dxa" w:w="1704"/>
+          </w:tcPr>
+          <w:p>
+            <w:r>
+              <w:t>10</w:t>
+            </w:r>
+          </w:p>
+        </w:tc>
+        <w:tc>
+          <w:tcPr>
+            <w:tcW w:type="dxa" w:w="1704"/>
+          </w:tcPr>
+          <w:p>
+            <w:r>
+              <w:t>5</w:t>
+            </w:r>
+          </w:p>
+        </w:tc>
+      </w:tr>
+      <w:tr>
+        <w:tc>
+          <w:tcPr>
+            <w:tcW w:type="dxa" w:w="1704"/>
+          </w:tcPr>
+          <w:p>
+            <w:r>
+              <w:t>18th</w:t>
+            </w:r>
+          </w:p>
+        </w:tc>
+        <w:tc>
+          <w:tcPr>
+            <w:tcW w:type="dxa" w:w="1704"/>
+          </w:tcPr>
+          <w:p>
+            <w:r>
+              <w:t>13</w:t>
+            </w:r>
+          </w:p>
+        </w:tc>
+        <w:tc>
+          <w:tcPr>
+            <w:tcW w:type="dxa" w:w="1704"/>
+          </w:tcPr>
+          <w:p>
+            <w:r>
+              <w:t>Genie Talent</w:t>
+            </w:r>
+          </w:p>
+        </w:tc>
+        <w:tc>
+          <w:tcPr>
+            <w:tcW w:type="dxa" w:w="1704"/>
+          </w:tcPr>
+          <w:p>
+            <w:r>
+              <w:t>+8</w:t>
+            </w:r>
+          </w:p>
+        </w:tc>
+        <w:tc>
+          <w:tcPr>
+            <w:tcW w:type="dxa" w:w="1704"/>
+          </w:tcPr>
+          <w:p>
+            <w:r>
+              <w:t>11</w:t>
+            </w:r>
+          </w:p>
+        </w:tc>
+        <w:tc>
+          <w:tcPr>
+            <w:tcW w:type="dxa" w:w="1704"/>
+          </w:tcPr>
+          <w:p>
+            <w:r>
+              <w:t>6</w:t>
+            </w:r>
+          </w:p>
+        </w:tc>
+      </w:tr>
+      <w:tr>
+        <w:tc>
+          <w:tcPr>
+            <w:tcW w:type="dxa" w:w="1704"/>
+          </w:tcPr>
+          <w:p>
+            <w:r>
+              <w:t>19th</w:t>
+            </w:r>
+          </w:p>
+        </w:tc>
+        <w:tc>
+          <w:tcPr>
+            <w:tcW w:type="dxa" w:w="1704"/>
+          </w:tcPr>
+          <w:p>
+            <w:r>
+              <w:t>14</w:t>
+            </w:r>
+          </w:p>
+        </w:tc>
+        <w:tc>
+          <w:tcPr>
+            <w:tcW w:type="dxa" w:w="1704"/>
+          </w:tcPr>
+          <w:p>
+            <w:r>
+              <w:t>—</w:t>
+            </w:r>
+          </w:p>
+        </w:tc>
+        <w:tc>
+          <w:tcPr>
+            <w:tcW w:type="dxa" w:w="1704"/>
+          </w:tcPr>
+          <w:p>
+            <w:r>
+              <w:t>+8</w:t>
+            </w:r>
+          </w:p>
+        </w:tc>
+        <w:tc>
+          <w:tcPr>
+            <w:tcW w:type="dxa" w:w="1704"/>
+          </w:tcPr>
+          <w:p>
+            <w:r>
+              <w:t>11</w:t>
+            </w:r>
+          </w:p>
+        </w:tc>
+        <w:tc>
+          <w:tcPr>
+            <w:tcW w:type="dxa" w:w="1704"/>
+          </w:tcPr>
+          <w:p>
+            <w:r>
+              <w:t>6</w:t>
+            </w:r>
+          </w:p>
+        </w:tc>
+      </w:tr>
+      <w:tr>
+        <w:tc>
+          <w:tcPr>
+            <w:tcW w:type="dxa" w:w="1704"/>
+          </w:tcPr>
+          <w:p>
+            <w:r>
+              <w:t>20th</w:t>
+            </w:r>
+          </w:p>
+        </w:tc>
+        <w:tc>
+          <w:tcPr>
+            <w:tcW w:type="dxa" w:w="1704"/>
+          </w:tcPr>
+          <w:p>
+            <w:r>
+              <w:t>15</w:t>
+            </w:r>
+          </w:p>
+        </w:tc>
+        <w:tc>
+          <w:tcPr>
+            <w:tcW w:type="dxa" w:w="1704"/>
+          </w:tcPr>
+          <w:p>
+            <w:r>
+              <w:t>Genie Ascension</w:t>
+            </w:r>
+          </w:p>
+        </w:tc>
+        <w:tc>
+          <w:tcPr>
+            <w:tcW w:type="dxa" w:w="1704"/>
+          </w:tcPr>
+          <w:p>
+            <w:r>
+              <w:t>+8</w:t>
+            </w:r>
+          </w:p>
+        </w:tc>
+        <w:tc>
+          <w:tcPr>
+            <w:tcW w:type="dxa" w:w="1704"/>
+          </w:tcPr>
+          <w:p>
+            <w:r>
+              <w:t>12</w:t>
+            </w:r>
+          </w:p>
+        </w:tc>
+        <w:tc>
+          <w:tcPr>
+            <w:tcW w:type="dxa" w:w="1704"/>
+          </w:tcPr>
+          <w:p>
+            <w:r>
+              <w:t>6</w:t>
+            </w:r>
+          </w:p>
+        </w:tc>
+      </w:tr>
+    </w:tbl>
+    <w:p>
+      <w:pPr>
+        <w:pStyle w:val="Heading3"/>
+      </w:pPr>
+      <w:r>
+        <w:t>Genie — Source Element Guidelines</w:t>
+      </w:r>
+    </w:p>
+    <w:tbl>
+      <w:tblPr>
+        <w:tblStyle w:val="LightShading-Accent1"/>
+        <w:tblW w:type="auto" w:w="0"/>
+        <w:tblLook w:firstColumn="1" w:firstRow="1" w:lastColumn="0" w:lastRow="0" w:noHBand="0" w:noVBand="1" w:val="04A0"/>
+      </w:tblPr>
+      <w:tblGrid>
+        <w:gridCol w:w="3408"/>
+        <w:gridCol w:w="3408"/>
+        <w:gridCol w:w="3408"/>
+      </w:tblGrid>
+      <w:tr>
+        <w:tc>
+          <w:tcPr>
+            <w:tcW w:type="dxa" w:w="3408"/>
+          </w:tcPr>
+          <w:p>
+            <w:r>
+              <w:t>Master Level</w:t>
+            </w:r>
+          </w:p>
+        </w:tc>
+        <w:tc>
+          <w:tcPr>
+            <w:tcW w:type="dxa" w:w="3408"/>
+          </w:tcPr>
+          <w:p>
+            <w:r>
+              <w:t>Elements</w:t>
+            </w:r>
+          </w:p>
+        </w:tc>
+        <w:tc>
+          <w:tcPr>
+            <w:tcW w:type="dxa" w:w="3408"/>
+          </w:tcPr>
+          <w:p>
+            <w:r>
+              <w:t>Available Elemental Effects</w:t>
+            </w:r>
+          </w:p>
+        </w:tc>
+      </w:tr>
+      <w:tr>
+        <w:tc>
+          <w:tcPr>
+            <w:tcW w:type="dxa" w:w="3408"/>
+          </w:tcPr>
+          <w:p>
+            <w:r>
+              <w:t>1st–2nd</w:t>
+            </w:r>
+          </w:p>
+        </w:tc>
+        <w:tc>
+          <w:tcPr>
+            <w:tcW w:type="dxa" w:w="3408"/>
+          </w:tcPr>
+          <w:p>
+            <w:r>
+              <w:t>—</w:t>
+            </w:r>
+          </w:p>
+        </w:tc>
+        <w:tc>
+          <w:tcPr>
+            <w:tcW w:type="dxa" w:w="3408"/>
+          </w:tcPr>
+          <w:p>
+            <w:r>
+              <w:t>None yet — elemental affinity not yet manifested</w:t>
+            </w:r>
+          </w:p>
+        </w:tc>
+      </w:tr>
+      <w:tr>
+        <w:tc>
+          <w:tcPr>
+            <w:tcW w:type="dxa" w:w="3408"/>
+          </w:tcPr>
+          <w:p>
+            <w:r>
+              <w:t>3rd–4th</w:t>
+            </w:r>
+          </w:p>
+        </w:tc>
+        <w:tc>
+          <w:tcPr>
+            <w:tcW w:type="dxa" w:w="3408"/>
+          </w:tcPr>
+          <w:p>
+            <w:r>
+              <w:t>1</w:t>
+            </w:r>
+          </w:p>
+        </w:tc>
+        <w:tc>
+          <w:tcPr>
+            <w:tcW w:type="dxa" w:w="3408"/>
+          </w:tcPr>
+          <w:p>
+            <w:r>
+              <w:t>Choose elemental affinity (fire, cold, electricity, or acid). Cultivated Power activates.</w:t>
+            </w:r>
+          </w:p>
+        </w:tc>
+      </w:tr>
+      <w:tr>
+        <w:tc>
+          <w:tcPr>
+            <w:tcW w:type="dxa" w:w="3408"/>
+          </w:tcPr>
+          <w:p>
+            <w:r>
+              <w:t>5th–8th</w:t>
+            </w:r>
+          </w:p>
+        </w:tc>
+        <w:tc>
+          <w:tcPr>
+            <w:tcW w:type="dxa" w:w="3408"/>
+          </w:tcPr>
+          <w:p>
+            <w:r>
+              <w:t>2</w:t>
+            </w:r>
+          </w:p>
+        </w:tc>
+        <w:tc>
+          <w:tcPr>
+            <w:tcW w:type="dxa" w:w="3408"/>
+          </w:tcPr>
+          <w:p>
+            <w:r>
+              <w:t>May spend Element slots on one additional elemental effect per encounter</w:t>
+            </w:r>
+          </w:p>
+        </w:tc>
+      </w:tr>
+      <w:tr>
+        <w:tc>
+          <w:tcPr>
+            <w:tcW w:type="dxa" w:w="3408"/>
+          </w:tcPr>
+          <w:p>
+            <w:r>
+              <w:t>9th–12th</w:t>
+            </w:r>
+          </w:p>
+        </w:tc>
+        <w:tc>
+          <w:tcPr>
+            <w:tcW w:type="dxa" w:w="3408"/>
+          </w:tcPr>
+          <w:p>
+            <w:r>
+              <w:t>3</w:t>
+            </w:r>
+          </w:p>
+        </w:tc>
+        <w:tc>
+          <w:tcPr>
+            <w:tcW w:type="dxa" w:w="3408"/>
+          </w:tcPr>
+          <w:p>
+            <w:r>
+              <w:t>Elemental damage from Cultivated Power increases to +2d6</w:t>
+            </w:r>
+          </w:p>
+        </w:tc>
+      </w:tr>
+      <w:tr>
+        <w:tc>
+          <w:tcPr>
+            <w:tcW w:type="dxa" w:w="3408"/>
+          </w:tcPr>
+          <w:p>
+            <w:r>
+              <w:t>13th–16th</w:t>
+            </w:r>
+          </w:p>
+        </w:tc>
+        <w:tc>
+          <w:tcPr>
+            <w:tcW w:type="dxa" w:w="3408"/>
+          </w:tcPr>
+          <w:p>
+            <w:r>
+              <w:t>4</w:t>
+            </w:r>
+          </w:p>
+        </w:tc>
+        <w:tc>
+          <w:tcPr>
+            <w:tcW w:type="dxa" w:w="3408"/>
+          </w:tcPr>
+          <w:p>
+            <w:r>
+              <w:t>May maintain two elemental effects simultaneously</w:t>
+            </w:r>
+          </w:p>
+        </w:tc>
+      </w:tr>
+      <w:tr>
+        <w:tc>
+          <w:tcPr>
+            <w:tcW w:type="dxa" w:w="3408"/>
+          </w:tcPr>
+          <w:p>
+            <w:r>
+              <w:t>17th–20th</w:t>
+            </w:r>
+          </w:p>
+        </w:tc>
+        <w:tc>
+          <w:tcPr>
+            <w:tcW w:type="dxa" w:w="3408"/>
+          </w:tcPr>
+          <w:p>
+            <w:r>
+              <w:t>5–6</w:t>
+            </w:r>
+          </w:p>
+        </w:tc>
+        <w:tc>
+          <w:tcPr>
+            <w:tcW w:type="dxa" w:w="3408"/>
+          </w:tcPr>
+          <w:p>
+            <w:r>
+              <w:t>Elemental damage from Cultivated Power increases to +4d6. Full elemental suite available.</w:t>
+            </w:r>
+          </w:p>
+        </w:tc>
+      </w:tr>
+    </w:tbl>
+    <w:p>
+      <w:pPr>
+        <w:pStyle w:val="Heading3"/>
+      </w:pPr>
+      <w:r>
+        <w:t>Similar to guardian but elemental focus</w:t>
+      </w:r>
+    </w:p>
+    <w:p>
+      <w:pPr>
+        <w:pStyle w:val="Heading3"/>
+      </w:pPr>
+      <w:r>
+        <w:t>Exclusive veils</w:t>
+      </w:r>
+    </w:p>
+    <w:p>
+      <w:pPr>
+        <w:pStyle w:val="Heading3"/>
+      </w:pPr>
+      <w:r>
+        <w:t>Genie Bond</w:t>
+      </w:r>
+    </w:p>
+    <w:p>
+      <w:pPr>
+        <w:pStyle w:val="Heading3"/>
+      </w:pPr>
+      <w:r>
+        <w:t>Sand Monarch Companion System · Pathfinder 1e</w:t>
+      </w:r>
+    </w:p>
+    <w:p>
+      <w:r>
+        <w:t>The Genie Bond represents the Sand Monarch's lifelong partnership with a unique spirit entity — not a djinn, efreeti, marid, or shaitan, but something rarer and more personal. The genie is always humanoid in appearance and present at the Monarch's side in court, in battle, and in private. Think of her as a companion first and a power source second.</w:t>
+      </w:r>
+    </w:p>
+    <w:p>
+      <w:r>
+        <w:t>The genie companion is separate from the Guardian system entirely. It does not occupy a Guardian slot, does not follow Guardian rules, and does not interact with Guardian class features. The two systems run in parallel.</w:t>
+      </w:r>
+    </w:p>
+    <w:p>
+      <w:pPr>
+        <w:pStyle w:val="Heading3"/>
+      </w:pPr>
+      <w:r>
+        <w:t>Baseline Statistics</w:t>
+      </w:r>
+    </w:p>
+    <w:p>
+      <w:pPr>
+        <w:pStyle w:val="Heading3"/>
+      </w:pPr>
+      <w:r>
+        <w:t>Vessel and Death</w:t>
+      </w:r>
+    </w:p>
+    <w:p>
+      <w:r>
+        <w:t>Vessel: The genie is anchored to a physical vessel — a ring, lamp, talisman, or similar object chosen when the bond is first formed. The genie may retreat into this vessel as a swift action and emerge from it as a move action. While inside the vessel the genie is inert and cannot act, but is fully protected from the outside world.</w:t>
+      </w:r>
+    </w:p>
+    <w:p>
+      <w:r>
+        <w:t>If the Genie is Reduced to 0 HP: The genie retreats to its vessel and cannot be permanently killed while the vessel exists. After one week of recovery the genie returns at full HP. The genie cannot be permanently destroyed by combat damage alone.</w:t>
+      </w:r>
+    </w:p>
+    <w:p>
+      <w:r>
+        <w:t>If the Vessel is Destroyed: The genie becomes dormant. The Monarch may craft a new vessel with one week of work and appropriate materials, at which point the genie awakens in the new vessel. The genie's personality, memories, and progression are fully preserved.</w:t>
+      </w:r>
+    </w:p>
+    <w:p>
+      <w:pPr>
+        <w:pStyle w:val="Heading3"/>
+      </w:pPr>
+      <w:r>
+        <w:t>Genie Companion Progression</w:t>
+      </w:r>
+    </w:p>
+    <w:p>
+      <w:pPr>
+        <w:pStyle w:val="Heading3"/>
+      </w:pPr>
+      <w:r>
+        <w:t>Core Features</w:t>
+      </w:r>
+    </w:p>
+    <w:p>
+      <w:r>
+        <w:t>All of the following are gained automatically and require no talent selection.</w:t>
+      </w:r>
+    </w:p>
+    <w:p>
+      <w:pPr>
+        <w:pStyle w:val="Heading3"/>
+      </w:pPr>
+      <w:r>
+        <w:t>Genie's Bounty (Su)</w:t>
+      </w:r>
+    </w:p>
+    <w:p>
+      <w:r>
+        <w:t>At 1st level the genie grants its master access to all Genie Talents it possesses. The Monarch may use any talent the genie knows, though some talents require the genie's active cooperation. Talents that grant spell-like abilities or transformative effects use the genie's statistics for determining their effects unless otherwise noted.</w:t>
+      </w:r>
+    </w:p>
+    <w:p>
+      <w:pPr>
+        <w:pStyle w:val="Heading3"/>
+      </w:pPr>
+      <w:r>
+        <w:t>Spiritual Development (Su)</w:t>
+      </w:r>
+    </w:p>
+    <w:p>
+      <w:r>
+        <w:t>The genie channels its essence into the Monarch, granting an enhancement bonus to either Strength or Dexterity. This bonus is shown in the Str/Dex Boost column of the progression table.</w:t>
+      </w:r>
+    </w:p>
+    <w:p>
+      <w:r>
+        <w:t>• Daily Choice: The Monarch chooses each morning whether the bonus applies to Strength or Dexterity.</w:t>
+      </w:r>
+    </w:p>
+    <w:p>
+      <w:r>
+        <w:t>• Split Bonus (9th level): Beginning at 9th level the Monarch may divide the boost between Strength and Dexterity in any combination totaling the listed value.</w:t>
+      </w:r>
+    </w:p>
+    <w:p>
+      <w:pPr>
+        <w:pStyle w:val="Heading3"/>
+      </w:pPr>
+      <w:r>
+        <w:t>Alertness (Ex)</w:t>
+      </w:r>
+    </w:p>
+    <w:p>
+      <w:r>
+        <w:t>While the genie is within 30 feet of its master and not inside the vessel, the Monarch gains the Alertness feat, providing a +2 bonus on Perception and Sense Motive checks. If the Monarch already has Alertness, the bonus increases to +4.</w:t>
+      </w:r>
+    </w:p>
+    <w:p>
+      <w:pPr>
+        <w:pStyle w:val="Heading3"/>
+      </w:pPr>
+      <w:r>
+        <w:t>Cultivated Power (Su)</w:t>
+      </w:r>
+    </w:p>
+    <w:p>
+      <w:r>
+        <w:t>At 3rd level the genie chooses an elemental affinity: fire, cold, electricity, or acid. This choice is permanent and defines the genie's elemental identity.</w:t>
+      </w:r>
+    </w:p>
+    <w:p>
+      <w:r>
+        <w:t>• The Monarch's weapon attacks deal bonus elemental damage of the chosen type. This damage starts at +1d6 at 3rd level and increases at 9th level (+2d6), 15th level (+3d6), and 20th level (+4d6).</w:t>
+      </w:r>
+    </w:p>
+    <w:p>
+      <w:r>
+        <w:t>• Outside of combat the genie can use its affinity for creative and narrative purposes — conjuring warmth, cooling the air, creating light from a spark, or soothing desert winds.</w:t>
+      </w:r>
+    </w:p>
+    <w:p>
+      <w:pPr>
+        <w:pStyle w:val="Heading3"/>
+      </w:pPr>
+      <w:r>
+        <w:t>Elements</w:t>
+      </w:r>
+    </w:p>
+    <w:p>
+      <w:r>
+        <w:t>Beginning at 2nd level the genie gains elemental affinity slots called Elements, shown in the progression table. These slots represent the genie's deepening mastery of its elemental nature and may be spent to activate additional elemental effects beyond Cultivated Power's baseline damage.</w:t>
+      </w:r>
+    </w:p>
+    <w:p>
+      <w:r>
+        <w:t>Element slots refresh each day. The specific elemental effects available are determined by the GM and player collaboratively based on the genie's chosen affinity. General guidelines:</w:t>
+      </w:r>
+    </w:p>
+    <w:p>
+      <w:pPr>
+        <w:pStyle w:val="Heading3"/>
+      </w:pPr>
+      <w:r>
+        <w:t>Genie Ascension (Su)</w:t>
+      </w:r>
+    </w:p>
+    <w:p>
+      <w:r>
+        <w:t>At 20th level the genie becomes a near-divine entity, greatly enhancing both its own power and the Monarch's influence. The following effects apply permanently:</w:t>
+      </w:r>
+    </w:p>
+    <w:p>
+      <w:r>
+        <w:t>• Wish: The genie may use wish as a spell-like ability once per day, using the genie's HD as its caster level. This is an alternative access point — non-Sand Monarch classes that bond with a genie companion also gain this ability through the genie at level 20 rather than through a class feature.</w:t>
+      </w:r>
+    </w:p>
+    <w:p>
+      <w:r>
+        <w:t>• Immortality Aura: The genie grants the Monarch immunity to fear and charm effects.</w:t>
+      </w:r>
+    </w:p>
+    <w:p>
+      <w:r>
+        <w:t>• Divine Presence: The Monarch gains a +4 bonus to all Charisma-based skill checks.</w:t>
+      </w:r>
+    </w:p>
+    <w:p>
+      <w:pPr>
+        <w:pStyle w:val="Heading3"/>
+      </w:pPr>
+      <w:r>
+        <w:t>Genie Talents</w:t>
+      </w:r>
+    </w:p>
+    <w:p>
+      <w:r>
+        <w:t>At 2nd level and every even level thereafter the genie selects one talent from the list below. All talents may only be selected once unless otherwise noted. The Monarch may use any talent the genie possesses via Genie's Bounty.</w:t>
+      </w:r>
+    </w:p>
+    <w:p>
+      <w:r>
+        <w:t>1. Eye Candy — The genie radiates supernatural allure. Grants a +4 bonus on Diplomacy and Bluff checks. Once per day the genie may create dazzling illusions in combat, imposing a -2 penalty on enemy attack rolls for 1d4 rounds (Will save negates, DC 10 + 1/2 genie HD + Cha modifier).</w:t>
+      </w:r>
+    </w:p>
+    <w:p>
+      <w:r>
+        <w:t>2. Companion of the Lonely — The genie grants the Companion of the Lonely vigilante talent. The Monarch also gains a +2 morale bonus on saves against fear effects.</w:t>
+      </w:r>
+    </w:p>
+    <w:p>
+      <w:r>
+        <w:t>3. Sisterhood of the Master — The genie harmonizes with all the Monarch's bonded companions. Grants a +1 bonus on Aid Another checks and a +1 insight bonus to AC when an ally is adjacent.</w:t>
+      </w:r>
+    </w:p>
+    <w:p>
+      <w:r>
+        <w:t>4. Initiate Magic — The genie channels its supernatural nature into spell-like abilities. The genie gains access to a number of genie-specific supernatural abilities (elemental bursts, planar awareness, spirit sight) determined by its elemental affinity and HD. These are not drawn from the wizard/sorcerer spell list but are native genie powers. Specific abilities are defined collaboratively by player and GM based on the genie's affinity and narrative.</w:t>
+      </w:r>
+    </w:p>
+    <w:p>
+      <w:r>
+        <w:t>5. Garden of Delight — Once per day the genie creates an extradimensional sanctuary lasting up to 8 hours. Allies inside the sanctuary gain a +2 bonus on Diplomacy checks and recover hit points at twice the normal rate during rest.</w:t>
+      </w:r>
+    </w:p>
+    <w:p>
+      <w:r>
+        <w:t>6. Eternal Promise — Once per day the genie may activate one of the following as an immediate action: absorb one attack targeting the Monarch (negating it entirely); grant the Monarch a +2 bonus to all rolls for 1 round; or heal the Monarch for 1d8 + genie HD hit points, taking the same amount as nonlethal damage itself.</w:t>
+      </w:r>
+    </w:p>
+    <w:p>
+      <w:r>
+        <w:t>7. Crest of the Magic Lord — Minimum genie level 16. The genie channels its near-divine power directly into the Monarch's casting, granting an additional spell slot of a level equal to 1/3 the genie's HD (maximum 5th level). This slot refreshes each day and may be used for any Spheres of Power effect or prepared spell the Monarch knows.</w:t>
+      </w:r>
+    </w:p>
+    <w:p>
+      <w:r>
+        <w:t>8. Awareness — The genie deepens its perceptual bond with the Monarch. Grants Alertness (stacks with existing bonus), Empathic Link (the Monarch is always aware of the genie's general emotional state regardless of distance), and Share Spells (spells with a target of 'you' may be cast on the genie while it is within 30 ft.).</w:t>
+      </w:r>
+    </w:p>
+    <w:p>
+      <w:r>
+        <w:t>9. Cultivator — The genie's Spiritual Development bonus may apply to Wisdom and Charisma instead of Strength and Dexterity. The daily choice now includes all four ability scores.</w:t>
+      </w:r>
+    </w:p>
+    <w:p>
+      <w:r>
+        <w:t>10. Master's New Clothes — The genie enhances the Monarch's appearance with subtle magical glamour. Grants a +2 bonus to Bluff, Diplomacy, and Disguise checks. The genie may also cast disguise self once per day on the Monarch as a spell-like ability.</w:t>
+      </w:r>
+    </w:p>
+    <w:p>
+      <w:r>
+        <w:t>11. Magi Change (Weapon) — The genie transforms itself into a magical weapon sized for the Monarch. The weapon has an enhancement bonus equal to half the genie's HD (minimum +1, maximum +5) and deals bonus elemental damage matching the genie's affinity. The weapon form may be any weapon the Monarch is proficient with, chosen when this talent is selected. The genie may revert to its normal form as a swift action.</w:t>
+      </w:r>
+    </w:p>
+    <w:p>
+      <w:r>
+        <w:t>12. Magi Change (Armor) — The genie transforms itself into a suit of magical armor sized for the Monarch. The armor has an enhancement bonus equal to half the genie's HD (minimum +1, maximum +5) and grants energy resistance 10 against the genie's elemental affinity. The armor type is chosen when this talent is selected. The genie may revert to its normal form as a swift action.</w:t>
+      </w:r>
+    </w:p>
+    <w:p>
+      <w:r>
+        <w:t>13. Slotted Magi Change — Prerequisite: Magi Change (Weapon) or Magi Change (Armor). Enhances the Magi Change forms with magical enhancement properties (equivalent to weapon/armor special abilities) chosen when the talent is selected, with a total bonus value not exceeding 1/4 the genie's HD.</w:t>
+      </w:r>
+    </w:p>
+    <w:p>
+      <w:r>
+        <w:t>14. Transportation — The genie unlocks the Carpet of the Sand Monarch companion system, functioning as an alternative entry point equivalent to the Carpet monarch art. If the Monarch already has the Carpet art, this talent instead grants the carpet a permanent +10 ft. speed increase. See the Carpet of the Sand Monarch document for full rules.</w:t>
+      </w:r>
+    </w:p>
+    <w:p>
+      <w:r>
+        <w:t>15. Genie's Veils — The genie gains the ability to bind veils using Charisma as its veil-weaving ability score. The genie may bind a number of veils equal to 1/4 its HD, accessing the veil list appropriate to its nature. [Akashic Mysteries]</w:t>
+      </w:r>
+    </w:p>
+    <w:p>
+      <w:r>
+        <w:t>16. Akashic Understanding — Prerequisite: Genie's Veils, genie level 8. Upgrades the genie to a full veil weaver with access to all standard chakra slots. The genie's essence pool equals its HD. [Akashic Mysteries]</w:t>
+      </w:r>
+    </w:p>
+    <w:p>
+      <w:r>
+        <w:t>17. Genie Blow — The genie delivers a massive elemental strike as a natural weapon attack. This is a standard melee attack using the genie's attack bonus, dealing 2d6 + Charisma modifier in damage of the genie's elemental affinity type. This scales by +1d6 every 4 genie levels (3d6 at level 4, 4d6 at level 8, and so on to a maximum of 7d6 at level 20).</w:t>
+      </w:r>
+    </w:p>
+    <w:p>
+      <w:r>
+        <w:t>18. Courtly Secrets — The genie's accumulated knowledge of courts and rulers flows to the Monarch. Grants Bardic Lore (adds 1/2 genie HD to Knowledge checks, all Knowledge checks untrained). If the Monarch already has Royal Lore, the genie's bonus adds an additional +2 insight bonus instead.</w:t>
+      </w:r>
+    </w:p>
+    <w:p>
+      <w:r>
+        <w:t>19. Elemental Bolt — The genie fires a ranged elemental attack as a standard action with a range of 60 ft. It deals 1d6 elemental damage per 3 genie HD (maximum 6d6 at HD 18). This is a ranged touch attack using the genie's attack bonus.</w:t>
+      </w:r>
+    </w:p>
+    <w:p>
+      <w:r>
+        <w:t>20. Elemental Armor — The genie shrouds the Monarch in swirling elemental energy as a swift action, lasting 1 minute per activation. While active: the Monarch gains energy resistance 10 against the genie's elemental affinity, and creatures that strike the Monarch with melee attacks take 1d6 elemental damage of the genie's affinity type. The genie may end this effect early as a free action.</w:t>
+      </w:r>
+    </w:p>
+    <w:p>
+      <w:pPr>
+        <w:pStyle w:val="Heading3"/>
+      </w:pPr>
+      <w:r>
+        <w:t>Sand craft</w:t>
+      </w:r>
+    </w:p>
+    <w:p>
+      <w:pPr>
+        <w:pStyle w:val="Heading3"/>
+      </w:pPr>
+      <w:r>
+        <w:t>Sundering mystic blow</w:t>
+      </w:r>
+    </w:p>
+    <w:p>
+      <w:pPr>
+        <w:pStyle w:val="Heading3"/>
+      </w:pPr>
+      <w:r>
+        <w:t>Bleeding mystic blow</w:t>
+      </w:r>
+    </w:p>
+    <w:p>
+      <w:pPr>
+        <w:pStyle w:val="Heading3"/>
+      </w:pPr>
+      <w:r>
+        <w:t>Rending mystic blow</w:t>
+      </w:r>
+    </w:p>
+    <w:p>
+      <w:pPr>
+        <w:pStyle w:val="Heading3"/>
+      </w:pPr>
+      <w:r>
+        <w:t>Accursed wounds</w:t>
+      </w:r>
+    </w:p>
+    <w:p>
+      <w:pPr>
+        <w:pStyle w:val="Heading3"/>
+      </w:pPr>
+      <w:r>
+        <w:t>War avatar</w:t>
+      </w:r>
+    </w:p>
+    <w:p>
+      <w:pPr>
+        <w:pStyle w:val="Heading3"/>
+      </w:pPr>
+      <w:r>
+        <w:t>Rejuvanating</w:t>
+      </w:r>
+    </w:p>
+    <w:p>
+      <w:pPr>
+        <w:pStyle w:val="Heading3"/>
+      </w:pPr>
+      <w:r>
+        <w:t>Clensing</w:t>
+      </w:r>
+    </w:p>
+    <w:p>
+      <w:pPr>
+        <w:pStyle w:val="Heading3"/>
+      </w:pPr>
+      <w:r>
+        <w:t>Centering</w:t>
+      </w:r>
+    </w:p>
+    <w:p>
+      <w:pPr>
+        <w:pStyle w:val="Heading3"/>
+      </w:pPr>
+      <w:r>
+        <w:t>invigorating</w:t>
+      </w:r>
+    </w:p>
+    <w:p>
+      <w:pPr>
+        <w:pStyle w:val="Heading3"/>
+      </w:pPr>
+      <w:r>
+        <w:t>Augmenting</w:t>
+      </w:r>
+    </w:p>
+    <w:p>
+      <w:pPr>
+        <w:pStyle w:val="Heading3"/>
+      </w:pPr>
+      <w:r>
+        <w:t>Bolstering</w:t>
+      </w:r>
+    </w:p>
+    <w:p>
+      <w:pPr>
+        <w:pStyle w:val="Heading3"/>
+      </w:pPr>
+      <w:r>
+        <w:t>Amped mystic blow</w:t>
+      </w:r>
+    </w:p>
+    <w:p>
+      <w:pPr>
+        <w:pStyle w:val="Heading3"/>
+      </w:pPr>
+      <w:r>
+        <w:t>Genie Completion Ledger</w:t>
+      </w:r>
+    </w:p>
+    <w:p>
+      <w:r>
+        <w:t>The affinity prose begins at level 3 while Elements begin at level 2. The element guidelines and Cultivated Power prose disagree on damage thresholds. Crest of the Magic Lord uses spell slots for sphere effects without defining that interface. Carpet requires its missing owning document. Name-only mystic-blow and support options remain reserves. Tables and donor text are preserved; none of these issues is silently normalized.</w:t>
+      </w:r>
+    </w:p>
+    <w:p>
+      <w:r>
+        <w:br w:type="page"/>
+      </w:r>
+    </w:p>
+    <w:p>
+      <w:pPr>
+        <w:pStyle w:val="Heading1"/>
+      </w:pPr>
+      <w:r>
         <w:t>Current Edition Notes</w:t>
       </w:r>
     </w:p>
@@ -10944,12 +15422,12 @@
         <w:pStyle w:val="Heading3"/>
       </w:pPr>
       <w:r>
-        <w:t>Source authority</w:t>
-      </w:r>
-    </w:p>
-    <w:p>
-      <w:r>
-        <w:t>This edition uses Night_Monarch_Revised_Master(1).pdf as its main source. Its integrated revision governs brand identity and ownership. Earlier source text is used only to restore the omitted Asura, Jaguar Sun and Rakshasa talent sections. The full Unison Device rules were not found and have not been invented.</w:t>
+        <w:t>Source Authority</w:t>
+      </w:r>
+    </w:p>
+    <w:p>
+      <w:r>
+        <w:t>The revised master governs class identity and unchanged mechanics. The uploaded Night Monarch Revision Packet supplies recovered source evidence. The author separately confirmed its Crimson Elixir replacement in this chat. Full original packet, feature inventory and table audit accompany this edition.</w:t>
       </w:r>
     </w:p>
     <w:p>
@@ -10957,12 +15435,12 @@
         <w:pStyle w:val="Heading3"/>
       </w:pPr>
       <w:r>
-        <w:t>Session corrections</w:t>
-      </w:r>
-    </w:p>
-    <w:p>
-      <w:r>
-        <w:t>The author removed the blood-point economy. Blood Pool, Dark Claim, Rejuvenation, Sanguine Invigoration, Conversion, Crimson Elixir, Blood Surge, Dark Harvest and Harlequin Gambler are removed because their rules depend on it. Infernal Stride retains its movement bonus; Gargoyle Perfect Defense retains its normal cooldown; Extended Palate retains its construct and outsider interactions. Their blood-point clauses are removed.</w:t>
+        <w:t>Preserved Cuts</w:t>
+      </w:r>
+    </w:p>
+    <w:p>
+      <w:r>
+        <w:t>The blood-point economy remains removed. Blood Pool, Dark Claim, Rejuvenation, Sanguine Invigoration, Conversion, Blood Surge and Dark Harvest remain cut. Harlequin Gambler’s old blood rule remains cut. Crimson Elixir is restored without blood points. Infernal Stride, Gargoyle Perfect Defense and Extended Palate retain their prior non-blood rules. Armament, Armament Expertise, Extra Armament, Abysscraft, Crimson Rites and the Genie Brand remain cut.</w:t>
       </w:r>
     </w:p>
     <w:p>
@@ -10970,25 +15448,12 @@
         <w:pStyle w:val="Heading3"/>
       </w:pPr>
       <w:r>
-        <w:t>Resolved base features</w:t>
-      </w:r>
-    </w:p>
-    <w:p>
-      <w:r>
-        <w:t>The revised master establishes d8 Hit Dice, Mid-Caster progression, Master of Night and Dark Lore. Armament, Armament Expertise, Extra Armament, Abysscraft and Crimson Rites remain cut. No removed feature has been reinstated from the older draft.</w:t>
-      </w:r>
-    </w:p>
-    <w:p>
-      <w:pPr>
-        <w:pStyle w:val="Heading3"/>
-      </w:pPr>
-      <w:r>
-        <w:t>Outstanding work</w:t>
-      </w:r>
-    </w:p>
-    <w:p>
-      <w:r>
-        <w:t>The integrated revision identifies the remaining work: Jiangshi favored disciplines, expanded Yuki-onna and Tengu talents, Oni Magic integration, and full Unison Device rules. Restored older talent text may contain incomplete entries. Blended Training prose still differs from its progression table; this edition does not silently decide that conflict.</w:t>
+        <w:t>Outstanding Rules</w:t>
+      </w:r>
+    </w:p>
+    <w:p>
+      <w:r>
+        <w:t>Unison’s acquisition and host mapping, barrier overlap/reset, missing progression feature bodies and Fast Unison, stored-spell interfaces, Puppet Mode timing and several talent interfaces remain unfinished. Crimson Elixir needs a healing caster level and exact vampire-template source/eligibility. Jiangshi’s remaining disciplines, Yuki-onna/Tengu expansion, Oni integration, Blended Training table/prose and copied donor conflicts are unresolved. This is a source-recovery revision, not a mechanically complete redesign.</w:t>
       </w:r>
     </w:p>
     <w:sectPr>

</xml_diff>